<commit_message>
Update installation documentation and add feature inventory
</commit_message>
<xml_diff>
--- a/readme.docx
+++ b/readme.docx
@@ -18,7 +18,7 @@
           <w:bCs/>
           <w:u w:val="single"/>
         </w:rPr>
-        <w:t>オープンソース</w:t>
+        <w:t>日本利用者向けWebベース</w:t>
       </w:r>
       <w:r>
         <w:rPr>
@@ -27,13 +27,22 @@
           <w:bCs/>
           <w:u w:val="single"/>
         </w:rPr>
-        <w:t>会計システム</w:t>
-      </w:r>
-    </w:p>
-    <w:p>
-      <w:pPr>
-        <w:rPr>
-          <w:rFonts w:ascii="ＭＳ Ｐゴシック" w:eastAsia="ＭＳ Ｐゴシック" w:hAnsi="ＭＳ Ｐゴシック" w:hint="eastAsia"/>
+        <w:t>オープンソース</w:t>
+      </w:r>
+      <w:r>
+        <w:rPr>
+          <w:rFonts w:ascii="ＭＳ Ｐゴシック" w:eastAsia="ＭＳ Ｐゴシック" w:hAnsi="ＭＳ Ｐゴシック" w:hint="eastAsia"/>
+          <w:b/>
+          <w:bCs/>
+          <w:u w:val="single"/>
+        </w:rPr>
+        <w:t>会計帳簿 （Accounting / First Success）</w:t>
+      </w:r>
+    </w:p>
+    <w:p>
+      <w:pPr>
+        <w:rPr>
+          <w:rFonts w:ascii="ＭＳ Ｐゴシック" w:eastAsia="ＭＳ Ｐゴシック" w:hAnsi="ＭＳ Ｐゴシック"/>
         </w:rPr>
       </w:pPr>
       <w:r>
@@ -41,6 +50,12 @@
           <w:rFonts w:ascii="ＭＳ Ｐゴシック" w:eastAsia="ＭＳ Ｐゴシック" w:hAnsi="ＭＳ Ｐゴシック" w:hint="eastAsia"/>
         </w:rPr>
         <w:t>インストール手順</w:t>
+      </w:r>
+      <w:r>
+        <w:rPr>
+          <w:rFonts w:ascii="ＭＳ Ｐゴシック" w:eastAsia="ＭＳ Ｐゴシック" w:hAnsi="ＭＳ Ｐゴシック" w:hint="eastAsia"/>
+        </w:rPr>
+        <w:t>及び免責事項</w:t>
       </w:r>
     </w:p>
     <w:p>
@@ -95,217 +110,17 @@
       <w:pPr>
         <w:rPr>
           <w:rFonts w:ascii="ＭＳ Ｐゴシック" w:eastAsia="ＭＳ Ｐゴシック" w:hAnsi="ＭＳ Ｐゴシック"/>
-        </w:rPr>
-      </w:pPr>
-    </w:p>
-    <w:p>
-      <w:pPr>
-        <w:rPr>
-          <w:rFonts w:ascii="ＭＳ Ｐゴシック" w:eastAsia="ＭＳ Ｐゴシック" w:hAnsi="ＭＳ Ｐゴシック" w:hint="eastAsia"/>
-        </w:rPr>
-      </w:pPr>
-      <w:r>
-        <w:rPr>
-          <w:rFonts w:ascii="ＭＳ Ｐゴシック" w:eastAsia="ＭＳ Ｐゴシック" w:hAnsi="ＭＳ Ｐゴシック" w:hint="eastAsia"/>
-        </w:rPr>
-        <w:t>バージョン改訂履歴</w:t>
-      </w:r>
-    </w:p>
-    <w:tbl>
-      <w:tblPr>
-        <w:tblStyle w:val="ac"/>
-        <w:tblW w:w="0" w:type="auto"/>
-        <w:tblLook w:val="04A0" w:firstRow="1" w:lastRow="0" w:firstColumn="1" w:lastColumn="0" w:noHBand="0" w:noVBand="1"/>
-      </w:tblPr>
-      <w:tblGrid>
-        <w:gridCol w:w="1980"/>
-        <w:gridCol w:w="8897"/>
-      </w:tblGrid>
-      <w:tr>
-        <w:tc>
-          <w:tcPr>
-            <w:tcW w:w="1980" w:type="dxa"/>
-          </w:tcPr>
-          <w:p>
-            <w:pPr>
-              <w:rPr>
-                <w:rFonts w:ascii="ＭＳ Ｐゴシック" w:eastAsia="ＭＳ Ｐゴシック" w:hAnsi="ＭＳ Ｐゴシック" w:hint="eastAsia"/>
-              </w:rPr>
-            </w:pPr>
-            <w:r>
-              <w:rPr>
-                <w:rFonts w:ascii="ＭＳ Ｐゴシック" w:eastAsia="ＭＳ Ｐゴシック" w:hAnsi="ＭＳ Ｐゴシック" w:hint="eastAsia"/>
-              </w:rPr>
-              <w:t>0.1</w:t>
-            </w:r>
-          </w:p>
-        </w:tc>
-        <w:tc>
-          <w:tcPr>
-            <w:tcW w:w="8897" w:type="dxa"/>
-          </w:tcPr>
-          <w:p>
-            <w:pPr>
-              <w:rPr>
-                <w:rFonts w:ascii="ＭＳ Ｐゴシック" w:eastAsia="ＭＳ Ｐゴシック" w:hAnsi="ＭＳ Ｐゴシック" w:hint="eastAsia"/>
-              </w:rPr>
-            </w:pPr>
-            <w:r>
-              <w:rPr>
-                <w:rFonts w:ascii="ＭＳ Ｐゴシック" w:eastAsia="ＭＳ Ｐゴシック" w:hAnsi="ＭＳ Ｐゴシック" w:hint="eastAsia"/>
-              </w:rPr>
-              <w:t>新規公開</w:t>
-            </w:r>
-          </w:p>
-        </w:tc>
-      </w:tr>
-      <w:tr>
-        <w:tc>
-          <w:tcPr>
-            <w:tcW w:w="1980" w:type="dxa"/>
-          </w:tcPr>
-          <w:p>
-            <w:pPr>
-              <w:rPr>
-                <w:rFonts w:ascii="ＭＳ Ｐゴシック" w:eastAsia="ＭＳ Ｐゴシック" w:hAnsi="ＭＳ Ｐゴシック" w:hint="eastAsia"/>
-              </w:rPr>
-            </w:pPr>
-          </w:p>
-        </w:tc>
-        <w:tc>
-          <w:tcPr>
-            <w:tcW w:w="8897" w:type="dxa"/>
-          </w:tcPr>
-          <w:p>
-            <w:pPr>
-              <w:rPr>
-                <w:rFonts w:ascii="ＭＳ Ｐゴシック" w:eastAsia="ＭＳ Ｐゴシック" w:hAnsi="ＭＳ Ｐゴシック" w:hint="eastAsia"/>
-              </w:rPr>
-            </w:pPr>
-          </w:p>
-        </w:tc>
-      </w:tr>
-      <w:tr>
-        <w:tc>
-          <w:tcPr>
-            <w:tcW w:w="1980" w:type="dxa"/>
-          </w:tcPr>
-          <w:p>
-            <w:pPr>
-              <w:rPr>
-                <w:rFonts w:ascii="ＭＳ Ｐゴシック" w:eastAsia="ＭＳ Ｐゴシック" w:hAnsi="ＭＳ Ｐゴシック" w:hint="eastAsia"/>
-              </w:rPr>
-            </w:pPr>
-          </w:p>
-        </w:tc>
-        <w:tc>
-          <w:tcPr>
-            <w:tcW w:w="8897" w:type="dxa"/>
-          </w:tcPr>
-          <w:p>
-            <w:pPr>
-              <w:rPr>
-                <w:rFonts w:ascii="ＭＳ Ｐゴシック" w:eastAsia="ＭＳ Ｐゴシック" w:hAnsi="ＭＳ Ｐゴシック" w:hint="eastAsia"/>
-              </w:rPr>
-            </w:pPr>
-          </w:p>
-        </w:tc>
-      </w:tr>
-      <w:tr>
-        <w:tc>
-          <w:tcPr>
-            <w:tcW w:w="1980" w:type="dxa"/>
-          </w:tcPr>
-          <w:p>
-            <w:pPr>
-              <w:rPr>
-                <w:rFonts w:ascii="ＭＳ Ｐゴシック" w:eastAsia="ＭＳ Ｐゴシック" w:hAnsi="ＭＳ Ｐゴシック" w:hint="eastAsia"/>
-              </w:rPr>
-            </w:pPr>
-          </w:p>
-        </w:tc>
-        <w:tc>
-          <w:tcPr>
-            <w:tcW w:w="8897" w:type="dxa"/>
-          </w:tcPr>
-          <w:p>
-            <w:pPr>
-              <w:rPr>
-                <w:rFonts w:ascii="ＭＳ Ｐゴシック" w:eastAsia="ＭＳ Ｐゴシック" w:hAnsi="ＭＳ Ｐゴシック" w:hint="eastAsia"/>
-              </w:rPr>
-            </w:pPr>
-          </w:p>
-        </w:tc>
-      </w:tr>
-      <w:tr>
-        <w:tc>
-          <w:tcPr>
-            <w:tcW w:w="1980" w:type="dxa"/>
-          </w:tcPr>
-          <w:p>
-            <w:pPr>
-              <w:rPr>
-                <w:rFonts w:ascii="ＭＳ Ｐゴシック" w:eastAsia="ＭＳ Ｐゴシック" w:hAnsi="ＭＳ Ｐゴシック" w:hint="eastAsia"/>
-              </w:rPr>
-            </w:pPr>
-          </w:p>
-        </w:tc>
-        <w:tc>
-          <w:tcPr>
-            <w:tcW w:w="8897" w:type="dxa"/>
-          </w:tcPr>
-          <w:p>
-            <w:pPr>
-              <w:rPr>
-                <w:rFonts w:ascii="ＭＳ Ｐゴシック" w:eastAsia="ＭＳ Ｐゴシック" w:hAnsi="ＭＳ Ｐゴシック" w:hint="eastAsia"/>
-              </w:rPr>
-            </w:pPr>
-          </w:p>
-        </w:tc>
-      </w:tr>
-      <w:tr>
-        <w:tc>
-          <w:tcPr>
-            <w:tcW w:w="1980" w:type="dxa"/>
-          </w:tcPr>
-          <w:p>
-            <w:pPr>
-              <w:rPr>
-                <w:rFonts w:ascii="ＭＳ Ｐゴシック" w:eastAsia="ＭＳ Ｐゴシック" w:hAnsi="ＭＳ Ｐゴシック" w:hint="eastAsia"/>
-              </w:rPr>
-            </w:pPr>
-          </w:p>
-        </w:tc>
-        <w:tc>
-          <w:tcPr>
-            <w:tcW w:w="8897" w:type="dxa"/>
-          </w:tcPr>
-          <w:p>
-            <w:pPr>
-              <w:rPr>
-                <w:rFonts w:ascii="ＭＳ Ｐゴシック" w:eastAsia="ＭＳ Ｐゴシック" w:hAnsi="ＭＳ Ｐゴシック" w:hint="eastAsia"/>
-              </w:rPr>
-            </w:pPr>
-          </w:p>
-        </w:tc>
-      </w:tr>
-    </w:tbl>
-    <w:p>
-      <w:pPr>
-        <w:rPr>
-          <w:rFonts w:ascii="ＭＳ Ｐゴシック" w:eastAsia="ＭＳ Ｐゴシック" w:hAnsi="ＭＳ Ｐゴシック" w:hint="eastAsia"/>
-        </w:rPr>
-      </w:pPr>
-    </w:p>
-    <w:p>
-      <w:pPr>
-        <w:rPr>
-          <w:rFonts w:ascii="ＭＳ Ｐゴシック" w:eastAsia="ＭＳ Ｐゴシック" w:hAnsi="ＭＳ Ｐゴシック"/>
-        </w:rPr>
-      </w:pPr>
-      <w:r>
-        <w:rPr>
-          <w:rFonts w:ascii="ＭＳ Ｐゴシック" w:eastAsia="ＭＳ Ｐゴシック" w:hAnsi="ＭＳ Ｐゴシック" w:hint="eastAsia"/>
+          <w:b/>
+          <w:bCs/>
+          <w:u w:val="single"/>
+        </w:rPr>
+      </w:pPr>
+      <w:r>
+        <w:rPr>
+          <w:rFonts w:ascii="ＭＳ Ｐゴシック" w:eastAsia="ＭＳ Ｐゴシック" w:hAnsi="ＭＳ Ｐゴシック" w:hint="eastAsia"/>
+          <w:b/>
+          <w:bCs/>
+          <w:u w:val="single"/>
         </w:rPr>
         <w:t>動作確認環境</w:t>
       </w:r>
@@ -327,6 +142,17 @@
           <w:rFonts w:ascii="ＭＳ Ｐゴシック" w:eastAsia="ＭＳ Ｐゴシック" w:hAnsi="ＭＳ Ｐゴシック"/>
         </w:rPr>
         <w:tab/>
+      </w:r>
+      <w:r>
+        <w:rPr>
+          <w:rFonts w:ascii="ＭＳ Ｐゴシック" w:eastAsia="ＭＳ Ｐゴシック" w:hAnsi="ＭＳ Ｐゴシック"/>
+        </w:rPr>
+        <w:tab/>
+      </w:r>
+      <w:r>
+        <w:rPr>
+          <w:rFonts w:ascii="ＭＳ Ｐゴシック" w:eastAsia="ＭＳ Ｐゴシック" w:hAnsi="ＭＳ Ｐゴシック"/>
+        </w:rPr>
         <w:t>設定値</w:t>
       </w:r>
     </w:p>
@@ -415,6 +241,12 @@
         <w:rPr>
           <w:rFonts w:ascii="ＭＳ Ｐゴシック" w:eastAsia="ＭＳ Ｐゴシック" w:hAnsi="ＭＳ Ｐゴシック" w:hint="eastAsia"/>
         </w:rPr>
+        <w:t>予定　　　2026年10月現在、未実装</w:t>
+      </w:r>
+      <w:r>
+        <w:rPr>
+          <w:rFonts w:ascii="ＭＳ Ｐゴシック" w:eastAsia="ＭＳ Ｐゴシック" w:hAnsi="ＭＳ Ｐゴシック" w:hint="eastAsia"/>
+        </w:rPr>
         <w:t>）</w:t>
       </w:r>
     </w:p>
@@ -455,12 +287,14 @@
           <w:rFonts w:ascii="ＭＳ Ｐゴシック" w:eastAsia="ＭＳ Ｐゴシック" w:hAnsi="ＭＳ Ｐゴシック"/>
         </w:rPr>
       </w:pPr>
+      <w:proofErr w:type="spellStart"/>
       <w:r>
         <w:rPr>
           <w:rFonts w:ascii="ＭＳ Ｐゴシック" w:eastAsia="ＭＳ Ｐゴシック" w:hAnsi="ＭＳ Ｐゴシック"/>
         </w:rPr>
         <w:t>npm</w:t>
       </w:r>
+      <w:proofErr w:type="spellEnd"/>
       <w:r>
         <w:rPr>
           <w:rFonts w:ascii="ＭＳ Ｐゴシック" w:eastAsia="ＭＳ Ｐゴシック" w:hAnsi="ＭＳ Ｐゴシック"/>
@@ -551,19 +385,110 @@
       <w:pPr>
         <w:rPr>
           <w:rFonts w:ascii="ＭＳ Ｐゴシック" w:eastAsia="ＭＳ Ｐゴシック" w:hAnsi="ＭＳ Ｐゴシック"/>
-        </w:rPr>
-      </w:pPr>
-      <w:r>
-        <w:rPr>
-          <w:rFonts w:ascii="ＭＳ Ｐゴシック" w:eastAsia="ＭＳ Ｐゴシック" w:hAnsi="ＭＳ Ｐゴシック" w:hint="eastAsia"/>
-        </w:rPr>
+          <w:b/>
+          <w:bCs/>
+          <w:u w:val="single"/>
+        </w:rPr>
+      </w:pPr>
+      <w:r>
+        <w:rPr>
+          <w:rFonts w:ascii="ＭＳ Ｐゴシック" w:eastAsia="ＭＳ Ｐゴシック" w:hAnsi="ＭＳ Ｐゴシック" w:hint="eastAsia"/>
+          <w:b/>
+          <w:bCs/>
+          <w:u w:val="single"/>
+        </w:rPr>
+        <w:t>開発背景</w:t>
+      </w:r>
+    </w:p>
+    <w:p>
+      <w:pPr>
+        <w:rPr>
+          <w:rFonts w:ascii="ＭＳ Ｐゴシック" w:eastAsia="ＭＳ Ｐゴシック" w:hAnsi="ＭＳ Ｐゴシック"/>
+        </w:rPr>
+      </w:pPr>
+      <w:r>
+        <w:rPr>
+          <w:rFonts w:ascii="ＭＳ Ｐゴシック" w:eastAsia="ＭＳ Ｐゴシック" w:hAnsi="ＭＳ Ｐゴシック" w:hint="eastAsia"/>
+        </w:rPr>
+        <w:t>本システムは生成AIを活用しJSONを使うことでデータベース変更等を極力避け更新頻度を高め</w:t>
+      </w:r>
+      <w:r>
+        <w:rPr>
+          <w:rFonts w:ascii="ＭＳ Ｐゴシック" w:eastAsia="ＭＳ Ｐゴシック" w:hAnsi="ＭＳ Ｐゴシック" w:hint="eastAsia"/>
+        </w:rPr>
+        <w:t>られ</w:t>
+      </w:r>
+      <w:r>
+        <w:rPr>
+          <w:rFonts w:ascii="ＭＳ Ｐゴシック" w:eastAsia="ＭＳ Ｐゴシック" w:hAnsi="ＭＳ Ｐゴシック" w:hint="eastAsia"/>
+        </w:rPr>
+        <w:t>る</w:t>
+      </w:r>
+      <w:r>
+        <w:rPr>
+          <w:rFonts w:ascii="ＭＳ Ｐゴシック" w:eastAsia="ＭＳ Ｐゴシック" w:hAnsi="ＭＳ Ｐゴシック" w:hint="eastAsia"/>
+        </w:rPr>
+        <w:t>方式</w:t>
+      </w:r>
+      <w:r>
+        <w:rPr>
+          <w:rFonts w:ascii="ＭＳ Ｐゴシック" w:eastAsia="ＭＳ Ｐゴシック" w:hAnsi="ＭＳ Ｐゴシック" w:hint="eastAsia"/>
+        </w:rPr>
+        <w:t>にしています。そのため一般的なRDBMSのERPシステムとはデータ格納状況が異なりますのでご了承ください。</w:t>
+      </w:r>
+    </w:p>
+    <w:p>
+      <w:pPr>
+        <w:rPr>
+          <w:rFonts w:ascii="ＭＳ Ｐゴシック" w:eastAsia="ＭＳ Ｐゴシック" w:hAnsi="ＭＳ Ｐゴシック"/>
+        </w:rPr>
+      </w:pPr>
+    </w:p>
+    <w:p>
+      <w:pPr>
+        <w:widowControl/>
+        <w:jc w:val="left"/>
+        <w:rPr>
+          <w:rFonts w:ascii="ＭＳ Ｐゴシック" w:eastAsia="ＭＳ Ｐゴシック" w:hAnsi="ＭＳ Ｐゴシック"/>
+          <w:b/>
+          <w:bCs/>
+          <w:u w:val="single"/>
+        </w:rPr>
+      </w:pPr>
+      <w:r>
+        <w:rPr>
+          <w:rFonts w:ascii="ＭＳ Ｐゴシック" w:eastAsia="ＭＳ Ｐゴシック" w:hAnsi="ＭＳ Ｐゴシック"/>
+          <w:b/>
+          <w:bCs/>
+          <w:u w:val="single"/>
+        </w:rPr>
+        <w:br w:type="page"/>
+      </w:r>
+    </w:p>
+    <w:p>
+      <w:pPr>
+        <w:rPr>
+          <w:rFonts w:ascii="ＭＳ Ｐゴシック" w:eastAsia="ＭＳ Ｐゴシック" w:hAnsi="ＭＳ Ｐゴシック"/>
+          <w:b/>
+          <w:bCs/>
+          <w:u w:val="single"/>
+        </w:rPr>
+      </w:pPr>
+      <w:r>
+        <w:rPr>
+          <w:rFonts w:ascii="ＭＳ Ｐゴシック" w:eastAsia="ＭＳ Ｐゴシック" w:hAnsi="ＭＳ Ｐゴシック" w:hint="eastAsia"/>
+          <w:b/>
+          <w:bCs/>
+          <w:u w:val="single"/>
+        </w:rPr>
+        <w:lastRenderedPageBreak/>
         <w:t>インストール手順</w:t>
       </w:r>
     </w:p>
     <w:p>
       <w:pPr>
         <w:rPr>
-          <w:rFonts w:ascii="ＭＳ Ｐゴシック" w:eastAsia="ＭＳ Ｐゴシック" w:hAnsi="ＭＳ Ｐゴシック" w:hint="eastAsia"/>
+          <w:rFonts w:ascii="ＭＳ Ｐゴシック" w:eastAsia="ＭＳ Ｐゴシック" w:hAnsi="ＭＳ Ｐゴシック"/>
         </w:rPr>
       </w:pPr>
     </w:p>
@@ -643,24 +568,31 @@
         </w:rPr>
         <w:t xml:space="preserve">　　　インスタンス名は</w:t>
       </w:r>
-      <w:r>
-        <w:rPr>
-          <w:rFonts w:ascii="ＭＳ Ｐゴシック" w:eastAsia="ＭＳ Ｐゴシック" w:hAnsi="ＭＳ Ｐゴシック"/>
-        </w:rPr>
-        <w:t>SQLExpressのままでOK、</w:t>
-      </w:r>
-    </w:p>
-    <w:p>
-      <w:pPr>
-        <w:rPr>
-          <w:rFonts w:ascii="ＭＳ Ｐゴシック" w:eastAsia="ＭＳ Ｐゴシック" w:hAnsi="ＭＳ Ｐゴシック"/>
-        </w:rPr>
-      </w:pPr>
-      <w:r>
-        <w:rPr>
-          <w:rFonts w:ascii="ＭＳ Ｐゴシック" w:eastAsia="ＭＳ Ｐゴシック" w:hAnsi="ＭＳ Ｐゴシック" w:hint="eastAsia"/>
-        </w:rPr>
-        <w:lastRenderedPageBreak/>
+      <w:proofErr w:type="spellStart"/>
+      <w:r>
+        <w:rPr>
+          <w:rFonts w:ascii="ＭＳ Ｐゴシック" w:eastAsia="ＭＳ Ｐゴシック" w:hAnsi="ＭＳ Ｐゴシック"/>
+        </w:rPr>
+        <w:t>SQLExpress</w:t>
+      </w:r>
+      <w:proofErr w:type="spellEnd"/>
+      <w:r>
+        <w:rPr>
+          <w:rFonts w:ascii="ＭＳ Ｐゴシック" w:eastAsia="ＭＳ Ｐゴシック" w:hAnsi="ＭＳ Ｐゴシック"/>
+        </w:rPr>
+        <w:t>のままでOK、</w:t>
+      </w:r>
+    </w:p>
+    <w:p>
+      <w:pPr>
+        <w:rPr>
+          <w:rFonts w:ascii="ＭＳ Ｐゴシック" w:eastAsia="ＭＳ Ｐゴシック" w:hAnsi="ＭＳ Ｐゴシック"/>
+        </w:rPr>
+      </w:pPr>
+      <w:r>
+        <w:rPr>
+          <w:rFonts w:ascii="ＭＳ Ｐゴシック" w:eastAsia="ＭＳ Ｐゴシック" w:hAnsi="ＭＳ Ｐゴシック" w:hint="eastAsia"/>
+        </w:rPr>
         <w:t xml:space="preserve">　　　認証モードは混合モードとし、</w:t>
       </w:r>
     </w:p>
@@ -676,11 +608,19 @@
         </w:rPr>
         <w:t xml:space="preserve">　　　</w:t>
       </w:r>
-      <w:r>
-        <w:rPr>
-          <w:rFonts w:ascii="ＭＳ Ｐゴシック" w:eastAsia="ＭＳ Ｐゴシック" w:hAnsi="ＭＳ Ｐゴシック"/>
-        </w:rPr>
-        <w:t>saのパスワードを設定（.envファイルに設定）</w:t>
+      <w:proofErr w:type="spellStart"/>
+      <w:r>
+        <w:rPr>
+          <w:rFonts w:ascii="ＭＳ Ｐゴシック" w:eastAsia="ＭＳ Ｐゴシック" w:hAnsi="ＭＳ Ｐゴシック"/>
+        </w:rPr>
+        <w:t>sa</w:t>
+      </w:r>
+      <w:proofErr w:type="spellEnd"/>
+      <w:r>
+        <w:rPr>
+          <w:rFonts w:ascii="ＭＳ Ｐゴシック" w:eastAsia="ＭＳ Ｐゴシック" w:hAnsi="ＭＳ Ｐゴシック"/>
+        </w:rPr>
+        <w:t>のパスワードを設定（.envファイルに設定）</w:t>
       </w:r>
     </w:p>
     <w:p>
@@ -728,11 +668,19 @@
           <w:rFonts w:ascii="ＭＳ Ｐゴシック" w:eastAsia="ＭＳ Ｐゴシック" w:hAnsi="ＭＳ Ｐゴシック"/>
         </w:rPr>
       </w:pPr>
-      <w:r>
-        <w:rPr>
-          <w:rFonts w:ascii="ＭＳ Ｐゴシック" w:eastAsia="ＭＳ Ｐゴシック" w:hAnsi="ＭＳ Ｐゴシック"/>
-        </w:rPr>
-        <w:t>optionalfeatures と入力してEnter</w:t>
+      <w:proofErr w:type="spellStart"/>
+      <w:r>
+        <w:rPr>
+          <w:rFonts w:ascii="ＭＳ Ｐゴシック" w:eastAsia="ＭＳ Ｐゴシック" w:hAnsi="ＭＳ Ｐゴシック"/>
+        </w:rPr>
+        <w:t>optionalfeatures</w:t>
+      </w:r>
+      <w:proofErr w:type="spellEnd"/>
+      <w:r>
+        <w:rPr>
+          <w:rFonts w:ascii="ＭＳ Ｐゴシック" w:eastAsia="ＭＳ Ｐゴシック" w:hAnsi="ＭＳ Ｐゴシック"/>
+        </w:rPr>
+        <w:t xml:space="preserve"> と入力してEnter</w:t>
       </w:r>
     </w:p>
     <w:p>
@@ -1153,11 +1101,19 @@
         </w:rPr>
         <w:t xml:space="preserve">　</w:t>
       </w:r>
-      <w:r>
-        <w:rPr>
-          <w:rFonts w:ascii="ＭＳ Ｐゴシック" w:eastAsia="ＭＳ Ｐゴシック" w:hAnsi="ＭＳ Ｐゴシック"/>
-        </w:rPr>
-        <w:t>powershellで</w:t>
+      <w:proofErr w:type="spellStart"/>
+      <w:r>
+        <w:rPr>
+          <w:rFonts w:ascii="ＭＳ Ｐゴシック" w:eastAsia="ＭＳ Ｐゴシック" w:hAnsi="ＭＳ Ｐゴシック"/>
+        </w:rPr>
+        <w:t>powershell</w:t>
+      </w:r>
+      <w:proofErr w:type="spellEnd"/>
+      <w:r>
+        <w:rPr>
+          <w:rFonts w:ascii="ＭＳ Ｐゴシック" w:eastAsia="ＭＳ Ｐゴシック" w:hAnsi="ＭＳ Ｐゴシック"/>
+        </w:rPr>
+        <w:t>で</w:t>
       </w:r>
     </w:p>
     <w:p>
@@ -1191,11 +1147,19 @@
         </w:rPr>
         <w:t xml:space="preserve">　</w:t>
       </w:r>
-      <w:r>
-        <w:rPr>
-          <w:rFonts w:ascii="ＭＳ Ｐゴシック" w:eastAsia="ＭＳ Ｐゴシック" w:hAnsi="ＭＳ Ｐゴシック"/>
-        </w:rPr>
-        <w:t>npm -v</w:t>
+      <w:proofErr w:type="spellStart"/>
+      <w:r>
+        <w:rPr>
+          <w:rFonts w:ascii="ＭＳ Ｐゴシック" w:eastAsia="ＭＳ Ｐゴシック" w:hAnsi="ＭＳ Ｐゴシック"/>
+        </w:rPr>
+        <w:t>npm</w:t>
+      </w:r>
+      <w:proofErr w:type="spellEnd"/>
+      <w:r>
+        <w:rPr>
+          <w:rFonts w:ascii="ＭＳ Ｐゴシック" w:eastAsia="ＭＳ Ｐゴシック" w:hAnsi="ＭＳ Ｐゴシック"/>
+        </w:rPr>
+        <w:t xml:space="preserve"> -v</w:t>
       </w:r>
     </w:p>
     <w:p>
@@ -1282,11 +1246,19 @@
         </w:rPr>
         <w:t>６．</w:t>
       </w:r>
-      <w:r>
-        <w:rPr>
-          <w:rFonts w:ascii="ＭＳ Ｐゴシック" w:eastAsia="ＭＳ Ｐゴシック" w:hAnsi="ＭＳ Ｐゴシック"/>
-        </w:rPr>
-        <w:t>powershellで次を実行</w:t>
+      <w:proofErr w:type="spellStart"/>
+      <w:r>
+        <w:rPr>
+          <w:rFonts w:ascii="ＭＳ Ｐゴシック" w:eastAsia="ＭＳ Ｐゴシック" w:hAnsi="ＭＳ Ｐゴシック"/>
+        </w:rPr>
+        <w:t>powershell</w:t>
+      </w:r>
+      <w:proofErr w:type="spellEnd"/>
+      <w:r>
+        <w:rPr>
+          <w:rFonts w:ascii="ＭＳ Ｐゴシック" w:eastAsia="ＭＳ Ｐゴシック" w:hAnsi="ＭＳ Ｐゴシック"/>
+        </w:rPr>
+        <w:t>で次を実行</w:t>
       </w:r>
     </w:p>
     <w:p>
@@ -1368,44 +1340,68 @@
           <w:rFonts w:ascii="ＭＳ Ｐゴシック" w:eastAsia="ＭＳ Ｐゴシック" w:hAnsi="ＭＳ Ｐゴシック"/>
         </w:rPr>
       </w:pPr>
-      <w:r>
-        <w:rPr>
-          <w:rFonts w:ascii="ＭＳ Ｐゴシック" w:eastAsia="ＭＳ Ｐゴシック" w:hAnsi="ＭＳ Ｐゴシック"/>
-        </w:rPr>
-        <w:t>dir -Force</w:t>
-      </w:r>
-    </w:p>
-    <w:p>
-      <w:pPr>
-        <w:rPr>
-          <w:rFonts w:ascii="ＭＳ Ｐゴシック" w:eastAsia="ＭＳ Ｐゴシック" w:hAnsi="ＭＳ Ｐゴシック"/>
-        </w:rPr>
-      </w:pPr>
-      <w:r>
-        <w:rPr>
-          <w:rFonts w:ascii="ＭＳ Ｐゴシック" w:eastAsia="ＭＳ Ｐゴシック" w:hAnsi="ＭＳ Ｐゴシック"/>
-        </w:rPr>
-        <w:t>npm ci</w:t>
-      </w:r>
-    </w:p>
-    <w:p>
-      <w:pPr>
-        <w:rPr>
-          <w:rFonts w:ascii="ＭＳ Ｐゴシック" w:eastAsia="ＭＳ Ｐゴシック" w:hAnsi="ＭＳ Ｐゴシック"/>
-        </w:rPr>
-      </w:pPr>
-    </w:p>
-    <w:p>
-      <w:pPr>
-        <w:rPr>
-          <w:rFonts w:ascii="ＭＳ Ｐゴシック" w:eastAsia="ＭＳ Ｐゴシック" w:hAnsi="ＭＳ Ｐゴシック"/>
-        </w:rPr>
-      </w:pPr>
-      <w:r>
-        <w:rPr>
-          <w:rFonts w:ascii="ＭＳ Ｐゴシック" w:eastAsia="ＭＳ Ｐゴシック" w:hAnsi="ＭＳ Ｐゴシック"/>
-        </w:rPr>
-        <w:t>users.jsonファイルを作成するため次のコマンドを実行：</w:t>
+      <w:proofErr w:type="spellStart"/>
+      <w:r>
+        <w:rPr>
+          <w:rFonts w:ascii="ＭＳ Ｐゴシック" w:eastAsia="ＭＳ Ｐゴシック" w:hAnsi="ＭＳ Ｐゴシック"/>
+        </w:rPr>
+        <w:t>dir</w:t>
+      </w:r>
+      <w:proofErr w:type="spellEnd"/>
+      <w:r>
+        <w:rPr>
+          <w:rFonts w:ascii="ＭＳ Ｐゴシック" w:eastAsia="ＭＳ Ｐゴシック" w:hAnsi="ＭＳ Ｐゴシック"/>
+        </w:rPr>
+        <w:t xml:space="preserve"> -Force</w:t>
+      </w:r>
+    </w:p>
+    <w:p>
+      <w:pPr>
+        <w:rPr>
+          <w:rFonts w:ascii="ＭＳ Ｐゴシック" w:eastAsia="ＭＳ Ｐゴシック" w:hAnsi="ＭＳ Ｐゴシック"/>
+        </w:rPr>
+      </w:pPr>
+      <w:proofErr w:type="spellStart"/>
+      <w:r>
+        <w:rPr>
+          <w:rFonts w:ascii="ＭＳ Ｐゴシック" w:eastAsia="ＭＳ Ｐゴシック" w:hAnsi="ＭＳ Ｐゴシック"/>
+        </w:rPr>
+        <w:t>npm</w:t>
+      </w:r>
+      <w:proofErr w:type="spellEnd"/>
+      <w:r>
+        <w:rPr>
+          <w:rFonts w:ascii="ＭＳ Ｐゴシック" w:eastAsia="ＭＳ Ｐゴシック" w:hAnsi="ＭＳ Ｐゴシック"/>
+        </w:rPr>
+        <w:t xml:space="preserve"> ci</w:t>
+      </w:r>
+    </w:p>
+    <w:p>
+      <w:pPr>
+        <w:rPr>
+          <w:rFonts w:ascii="ＭＳ Ｐゴシック" w:eastAsia="ＭＳ Ｐゴシック" w:hAnsi="ＭＳ Ｐゴシック"/>
+        </w:rPr>
+      </w:pPr>
+    </w:p>
+    <w:p>
+      <w:pPr>
+        <w:rPr>
+          <w:rFonts w:ascii="ＭＳ Ｐゴシック" w:eastAsia="ＭＳ Ｐゴシック" w:hAnsi="ＭＳ Ｐゴシック"/>
+        </w:rPr>
+      </w:pPr>
+      <w:proofErr w:type="spellStart"/>
+      <w:r>
+        <w:rPr>
+          <w:rFonts w:ascii="ＭＳ Ｐゴシック" w:eastAsia="ＭＳ Ｐゴシック" w:hAnsi="ＭＳ Ｐゴシック"/>
+        </w:rPr>
+        <w:t>users.json</w:t>
+      </w:r>
+      <w:proofErr w:type="spellEnd"/>
+      <w:r>
+        <w:rPr>
+          <w:rFonts w:ascii="ＭＳ Ｐゴシック" w:eastAsia="ＭＳ Ｐゴシック" w:hAnsi="ＭＳ Ｐゴシック"/>
+        </w:rPr>
+        <w:t>ファイルを作成するため次のコマンドを実行：</w:t>
       </w:r>
     </w:p>
     <w:p>
@@ -1431,20 +1427,56 @@
         <w:rPr>
           <w:rFonts w:ascii="ＭＳ Ｐゴシック" w:eastAsia="ＭＳ Ｐゴシック" w:hAnsi="ＭＳ Ｐゴシック"/>
         </w:rPr>
-        <w:t>$secure = Read-Host "画面ログイン用パスワード（16文字以上）" -AsSecureString</w:t>
-      </w:r>
-    </w:p>
-    <w:p>
-      <w:pPr>
-        <w:rPr>
-          <w:rFonts w:ascii="ＭＳ Ｐゴシック" w:eastAsia="ＭＳ Ｐゴシック" w:hAnsi="ＭＳ Ｐゴシック"/>
-        </w:rPr>
-      </w:pPr>
-      <w:r>
-        <w:rPr>
-          <w:rFonts w:ascii="ＭＳ Ｐゴシック" w:eastAsia="ＭＳ Ｐゴシック" w:hAnsi="ＭＳ Ｐゴシック"/>
-        </w:rPr>
-        <w:t>$env:APP_PASSWORD = [System.Net.NetworkCredential]::new('', $secure).Password</w:t>
+        <w:t>$secure = Read-Host "画面ログイン用パスワード（16文字以上）" -</w:t>
+      </w:r>
+      <w:proofErr w:type="spellStart"/>
+      <w:r>
+        <w:rPr>
+          <w:rFonts w:ascii="ＭＳ Ｐゴシック" w:eastAsia="ＭＳ Ｐゴシック" w:hAnsi="ＭＳ Ｐゴシック"/>
+        </w:rPr>
+        <w:t>AsSecureString</w:t>
+      </w:r>
+      <w:proofErr w:type="spellEnd"/>
+    </w:p>
+    <w:p>
+      <w:pPr>
+        <w:rPr>
+          <w:rFonts w:ascii="ＭＳ Ｐゴシック" w:eastAsia="ＭＳ Ｐゴシック" w:hAnsi="ＭＳ Ｐゴシック"/>
+        </w:rPr>
+      </w:pPr>
+      <w:r>
+        <w:rPr>
+          <w:rFonts w:ascii="ＭＳ Ｐゴシック" w:eastAsia="ＭＳ Ｐゴシック" w:hAnsi="ＭＳ Ｐゴシック"/>
+        </w:rPr>
+        <w:t>$</w:t>
+      </w:r>
+      <w:proofErr w:type="spellStart"/>
+      <w:r>
+        <w:rPr>
+          <w:rFonts w:ascii="ＭＳ Ｐゴシック" w:eastAsia="ＭＳ Ｐゴシック" w:hAnsi="ＭＳ Ｐゴシック"/>
+        </w:rPr>
+        <w:t>env:APP_PASSWORD</w:t>
+      </w:r>
+      <w:proofErr w:type="spellEnd"/>
+      <w:r>
+        <w:rPr>
+          <w:rFonts w:ascii="ＭＳ Ｐゴシック" w:eastAsia="ＭＳ Ｐゴシック" w:hAnsi="ＭＳ Ｐゴシック"/>
+        </w:rPr>
+        <w:t xml:space="preserve"> = [</w:t>
+      </w:r>
+      <w:proofErr w:type="spellStart"/>
+      <w:r>
+        <w:rPr>
+          <w:rFonts w:ascii="ＭＳ Ｐゴシック" w:eastAsia="ＭＳ Ｐゴシック" w:hAnsi="ＭＳ Ｐゴシック"/>
+        </w:rPr>
+        <w:t>System.Net.NetworkCredential</w:t>
+      </w:r>
+      <w:proofErr w:type="spellEnd"/>
+      <w:r>
+        <w:rPr>
+          <w:rFonts w:ascii="ＭＳ Ｐゴシック" w:eastAsia="ＭＳ Ｐゴシック" w:hAnsi="ＭＳ Ｐゴシック"/>
+        </w:rPr>
+        <w:t>]::new('', $secure).Password</w:t>
       </w:r>
     </w:p>
     <w:p>
@@ -1555,20 +1587,48 @@
         <w:rPr>
           <w:rFonts w:ascii="ＭＳ Ｐゴシック" w:eastAsia="ＭＳ Ｐゴシック" w:hAnsi="ＭＳ Ｐゴシック"/>
         </w:rPr>
-        <w:t>Existing companies.owner value</w:t>
-      </w:r>
-    </w:p>
-    <w:p>
-      <w:pPr>
-        <w:rPr>
-          <w:rFonts w:ascii="ＭＳ Ｐゴシック" w:eastAsia="ＭＳ Ｐゴシック" w:hAnsi="ＭＳ Ｐゴシック"/>
-        </w:rPr>
-      </w:pPr>
-      <w:r>
-        <w:rPr>
-          <w:rFonts w:ascii="ＭＳ Ｐゴシック" w:eastAsia="ＭＳ Ｐゴシック" w:hAnsi="ＭＳ Ｐゴシック"/>
-        </w:rPr>
-        <w:t xml:space="preserve">data\database-partial.jsonのtables </w:t>
+        <w:t xml:space="preserve">Existing </w:t>
+      </w:r>
+      <w:proofErr w:type="spellStart"/>
+      <w:r>
+        <w:rPr>
+          <w:rFonts w:ascii="ＭＳ Ｐゴシック" w:eastAsia="ＭＳ Ｐゴシック" w:hAnsi="ＭＳ Ｐゴシック"/>
+        </w:rPr>
+        <w:t>companies.owner</w:t>
+      </w:r>
+      <w:proofErr w:type="spellEnd"/>
+      <w:r>
+        <w:rPr>
+          <w:rFonts w:ascii="ＭＳ Ｐゴシック" w:eastAsia="ＭＳ Ｐゴシック" w:hAnsi="ＭＳ Ｐゴシック"/>
+        </w:rPr>
+        <w:t xml:space="preserve"> value</w:t>
+      </w:r>
+    </w:p>
+    <w:p>
+      <w:pPr>
+        <w:rPr>
+          <w:rFonts w:ascii="ＭＳ Ｐゴシック" w:eastAsia="ＭＳ Ｐゴシック" w:hAnsi="ＭＳ Ｐゴシック"/>
+        </w:rPr>
+      </w:pPr>
+      <w:r>
+        <w:rPr>
+          <w:rFonts w:ascii="ＭＳ Ｐゴシック" w:eastAsia="ＭＳ Ｐゴシック" w:hAnsi="ＭＳ Ｐゴシック"/>
+        </w:rPr>
+        <w:t>data\database-</w:t>
+      </w:r>
+      <w:proofErr w:type="spellStart"/>
+      <w:r>
+        <w:rPr>
+          <w:rFonts w:ascii="ＭＳ Ｐゴシック" w:eastAsia="ＭＳ Ｐゴシック" w:hAnsi="ＭＳ Ｐゴシック"/>
+        </w:rPr>
+        <w:t>partial.json</w:t>
+      </w:r>
+      <w:proofErr w:type="spellEnd"/>
+      <w:r>
+        <w:rPr>
+          <w:rFonts w:ascii="ＭＳ Ｐゴシック" w:eastAsia="ＭＳ Ｐゴシック" w:hAnsi="ＭＳ Ｐゴシック"/>
+        </w:rPr>
+        <w:t xml:space="preserve">のtables </w:t>
       </w:r>
     </w:p>
     <w:p>
@@ -1594,7 +1654,6 @@
         <w:rPr>
           <w:rFonts w:ascii="ＭＳ Ｐゴシック" w:eastAsia="ＭＳ Ｐゴシック" w:hAnsi="ＭＳ Ｐゴシック"/>
         </w:rPr>
-        <w:lastRenderedPageBreak/>
         <w:t>GFIuPHYms6GURbvMbMFgLqC4KUv3d5HAxlmsMwFKCjkOts0wM2G7HN</w:t>
       </w:r>
     </w:p>
@@ -1688,8 +1747,16 @@
         <w:rPr>
           <w:rFonts w:ascii="ＭＳ Ｐゴシック" w:eastAsia="ＭＳ Ｐゴシック" w:hAnsi="ＭＳ Ｐゴシック"/>
         </w:rPr>
-        <w:t>Remove-Item Env:APP_PASSWORD</w:t>
-      </w:r>
+        <w:t xml:space="preserve">Remove-Item </w:t>
+      </w:r>
+      <w:proofErr w:type="spellStart"/>
+      <w:r>
+        <w:rPr>
+          <w:rFonts w:ascii="ＭＳ Ｐゴシック" w:eastAsia="ＭＳ Ｐゴシック" w:hAnsi="ＭＳ Ｐゴシック"/>
+        </w:rPr>
+        <w:t>Env:APP_PASSWORD</w:t>
+      </w:r>
+      <w:proofErr w:type="spellEnd"/>
     </w:p>
     <w:p>
       <w:pPr>
@@ -1939,6 +2006,7 @@
         <w:rPr>
           <w:rFonts w:ascii="ＭＳ Ｐゴシック" w:eastAsia="ＭＳ Ｐゴシック" w:hAnsi="ＭＳ Ｐゴシック" w:hint="eastAsia"/>
         </w:rPr>
+        <w:lastRenderedPageBreak/>
         <w:t>９．</w:t>
       </w:r>
       <w:r>
@@ -1958,7 +2026,21 @@
         <w:rPr>
           <w:rFonts w:ascii="ＭＳ Ｐゴシック" w:eastAsia="ＭＳ Ｐゴシック" w:hAnsi="ＭＳ Ｐゴシック"/>
         </w:rPr>
-        <w:t>Test-NetConnection 127.0.0.1 -Port 1433</w:t>
+        <w:t>Test-</w:t>
+      </w:r>
+      <w:proofErr w:type="spellStart"/>
+      <w:r>
+        <w:rPr>
+          <w:rFonts w:ascii="ＭＳ Ｐゴシック" w:eastAsia="ＭＳ Ｐゴシック" w:hAnsi="ＭＳ Ｐゴシック"/>
+        </w:rPr>
+        <w:t>NetConnection</w:t>
+      </w:r>
+      <w:proofErr w:type="spellEnd"/>
+      <w:r>
+        <w:rPr>
+          <w:rFonts w:ascii="ＭＳ Ｐゴシック" w:eastAsia="ＭＳ Ｐゴシック" w:hAnsi="ＭＳ Ｐゴシック"/>
+        </w:rPr>
+        <w:t xml:space="preserve"> 127.0.0.1 -Port 1433</w:t>
       </w:r>
     </w:p>
     <w:p>
@@ -2045,11 +2127,19 @@
         </w:rPr>
         <w:t>１１．</w:t>
       </w:r>
-      <w:r>
-        <w:rPr>
-          <w:rFonts w:ascii="ＭＳ Ｐゴシック" w:eastAsia="ＭＳ Ｐゴシック" w:hAnsi="ＭＳ Ｐゴシック"/>
-        </w:rPr>
-        <w:t>npm start</w:t>
+      <w:proofErr w:type="spellStart"/>
+      <w:r>
+        <w:rPr>
+          <w:rFonts w:ascii="ＭＳ Ｐゴシック" w:eastAsia="ＭＳ Ｐゴシック" w:hAnsi="ＭＳ Ｐゴシック"/>
+        </w:rPr>
+        <w:t>npm</w:t>
+      </w:r>
+      <w:proofErr w:type="spellEnd"/>
+      <w:r>
+        <w:rPr>
+          <w:rFonts w:ascii="ＭＳ Ｐゴシック" w:eastAsia="ＭＳ Ｐゴシック" w:hAnsi="ＭＳ Ｐゴシック"/>
+        </w:rPr>
+        <w:t xml:space="preserve"> start</w:t>
       </w:r>
     </w:p>
     <w:p>
@@ -2127,21 +2217,57 @@
         <w:rPr>
           <w:rFonts w:ascii="ＭＳ Ｐゴシック" w:eastAsia="ＭＳ Ｐゴシック" w:hAnsi="ＭＳ Ｐゴシック"/>
         </w:rPr>
-        <w:t>Get-ChildItem -Recurse -File -Include *.sql |</w:t>
-      </w:r>
-    </w:p>
-    <w:p>
-      <w:pPr>
-        <w:rPr>
-          <w:rFonts w:ascii="ＭＳ Ｐゴシック" w:eastAsia="ＭＳ Ｐゴシック" w:hAnsi="ＭＳ Ｐゴシック"/>
-        </w:rPr>
-      </w:pPr>
-      <w:r>
-        <w:rPr>
-          <w:rFonts w:ascii="ＭＳ Ｐゴシック" w:eastAsia="ＭＳ Ｐゴシック" w:hAnsi="ＭＳ Ｐゴシック"/>
-        </w:rPr>
-        <w:t>Select-Object FullName</w:t>
-      </w:r>
+        <w:t>Get-</w:t>
+      </w:r>
+      <w:proofErr w:type="spellStart"/>
+      <w:r>
+        <w:rPr>
+          <w:rFonts w:ascii="ＭＳ Ｐゴシック" w:eastAsia="ＭＳ Ｐゴシック" w:hAnsi="ＭＳ Ｐゴシック"/>
+        </w:rPr>
+        <w:t>ChildItem</w:t>
+      </w:r>
+      <w:proofErr w:type="spellEnd"/>
+      <w:r>
+        <w:rPr>
+          <w:rFonts w:ascii="ＭＳ Ｐゴシック" w:eastAsia="ＭＳ Ｐゴシック" w:hAnsi="ＭＳ Ｐゴシック"/>
+        </w:rPr>
+        <w:t xml:space="preserve"> -Recurse -File -Include *.</w:t>
+      </w:r>
+      <w:proofErr w:type="spellStart"/>
+      <w:r>
+        <w:rPr>
+          <w:rFonts w:ascii="ＭＳ Ｐゴシック" w:eastAsia="ＭＳ Ｐゴシック" w:hAnsi="ＭＳ Ｐゴシック"/>
+        </w:rPr>
+        <w:t>sql</w:t>
+      </w:r>
+      <w:proofErr w:type="spellEnd"/>
+      <w:r>
+        <w:rPr>
+          <w:rFonts w:ascii="ＭＳ Ｐゴシック" w:eastAsia="ＭＳ Ｐゴシック" w:hAnsi="ＭＳ Ｐゴシック"/>
+        </w:rPr>
+        <w:t xml:space="preserve"> |</w:t>
+      </w:r>
+    </w:p>
+    <w:p>
+      <w:pPr>
+        <w:rPr>
+          <w:rFonts w:ascii="ＭＳ Ｐゴシック" w:eastAsia="ＭＳ Ｐゴシック" w:hAnsi="ＭＳ Ｐゴシック"/>
+        </w:rPr>
+      </w:pPr>
+      <w:r>
+        <w:rPr>
+          <w:rFonts w:ascii="ＭＳ Ｐゴシック" w:eastAsia="ＭＳ Ｐゴシック" w:hAnsi="ＭＳ Ｐゴシック"/>
+        </w:rPr>
+        <w:t xml:space="preserve">Select-Object </w:t>
+      </w:r>
+      <w:proofErr w:type="spellStart"/>
+      <w:r>
+        <w:rPr>
+          <w:rFonts w:ascii="ＭＳ Ｐゴシック" w:eastAsia="ＭＳ Ｐゴシック" w:hAnsi="ＭＳ Ｐゴシック"/>
+        </w:rPr>
+        <w:t>FullName</w:t>
+      </w:r>
+      <w:proofErr w:type="spellEnd"/>
     </w:p>
     <w:p>
       <w:pPr>
@@ -2343,6 +2469,7 @@
         <w:rPr>
           <w:rFonts w:ascii="ＭＳ Ｐゴシック" w:eastAsia="ＭＳ Ｐゴシック" w:hAnsi="ＭＳ Ｐゴシック" w:hint="eastAsia"/>
         </w:rPr>
+        <w:lastRenderedPageBreak/>
         <w:t>１４．</w:t>
       </w:r>
       <w:r>
@@ -2440,7 +2567,6 @@
         <w:rPr>
           <w:rFonts w:ascii="ＭＳ Ｐゴシック" w:eastAsia="ＭＳ Ｐゴシック" w:hAnsi="ＭＳ Ｐゴシック"/>
         </w:rPr>
-        <w:lastRenderedPageBreak/>
         <w:t>WHERE TABLE_TYPE = 'BASE TABLE'</w:t>
       </w:r>
     </w:p>
@@ -2503,12 +2629,14 @@
           <w:rFonts w:ascii="ＭＳ Ｐゴシック" w:eastAsia="ＭＳ Ｐゴシック" w:hAnsi="ＭＳ Ｐゴシック"/>
         </w:rPr>
       </w:pPr>
+      <w:proofErr w:type="spellStart"/>
       <w:r>
         <w:rPr>
           <w:rFonts w:ascii="ＭＳ Ｐゴシック" w:eastAsia="ＭＳ Ｐゴシック" w:hAnsi="ＭＳ Ｐゴシック"/>
         </w:rPr>
         <w:t>dbo</w:t>
       </w:r>
+      <w:proofErr w:type="spellEnd"/>
       <w:r>
         <w:rPr>
           <w:rFonts w:ascii="ＭＳ Ｐゴシック" w:eastAsia="ＭＳ Ｐゴシック" w:hAnsi="ＭＳ Ｐゴシック"/>
@@ -2523,12 +2651,14 @@
           <w:rFonts w:ascii="ＭＳ Ｐゴシック" w:eastAsia="ＭＳ Ｐゴシック" w:hAnsi="ＭＳ Ｐゴシック"/>
         </w:rPr>
       </w:pPr>
+      <w:proofErr w:type="spellStart"/>
       <w:r>
         <w:rPr>
           <w:rFonts w:ascii="ＭＳ Ｐゴシック" w:eastAsia="ＭＳ Ｐゴシック" w:hAnsi="ＭＳ Ｐゴシック"/>
         </w:rPr>
         <w:t>dbo</w:t>
       </w:r>
+      <w:proofErr w:type="spellEnd"/>
       <w:r>
         <w:rPr>
           <w:rFonts w:ascii="ＭＳ Ｐゴシック" w:eastAsia="ＭＳ Ｐゴシック" w:hAnsi="ＭＳ Ｐゴシック"/>
@@ -2543,12 +2673,14 @@
           <w:rFonts w:ascii="ＭＳ Ｐゴシック" w:eastAsia="ＭＳ Ｐゴシック" w:hAnsi="ＭＳ Ｐゴシック"/>
         </w:rPr>
       </w:pPr>
+      <w:proofErr w:type="spellStart"/>
       <w:r>
         <w:rPr>
           <w:rFonts w:ascii="ＭＳ Ｐゴシック" w:eastAsia="ＭＳ Ｐゴシック" w:hAnsi="ＭＳ Ｐゴシック"/>
         </w:rPr>
         <w:t>dbo</w:t>
       </w:r>
+      <w:proofErr w:type="spellEnd"/>
       <w:r>
         <w:rPr>
           <w:rFonts w:ascii="ＭＳ Ｐゴシック" w:eastAsia="ＭＳ Ｐゴシック" w:hAnsi="ＭＳ Ｐゴシック"/>
@@ -2563,12 +2695,14 @@
           <w:rFonts w:ascii="ＭＳ Ｐゴシック" w:eastAsia="ＭＳ Ｐゴシック" w:hAnsi="ＭＳ Ｐゴシック"/>
         </w:rPr>
       </w:pPr>
+      <w:proofErr w:type="spellStart"/>
       <w:r>
         <w:rPr>
           <w:rFonts w:ascii="ＭＳ Ｐゴシック" w:eastAsia="ＭＳ Ｐゴシック" w:hAnsi="ＭＳ Ｐゴシック"/>
         </w:rPr>
         <w:t>dbo</w:t>
       </w:r>
+      <w:proofErr w:type="spellEnd"/>
       <w:r>
         <w:rPr>
           <w:rFonts w:ascii="ＭＳ Ｐゴシック" w:eastAsia="ＭＳ Ｐゴシック" w:hAnsi="ＭＳ Ｐゴシック"/>
@@ -2583,12 +2717,14 @@
           <w:rFonts w:ascii="ＭＳ Ｐゴシック" w:eastAsia="ＭＳ Ｐゴシック" w:hAnsi="ＭＳ Ｐゴシック"/>
         </w:rPr>
       </w:pPr>
+      <w:proofErr w:type="spellStart"/>
       <w:r>
         <w:rPr>
           <w:rFonts w:ascii="ＭＳ Ｐゴシック" w:eastAsia="ＭＳ Ｐゴシック" w:hAnsi="ＭＳ Ｐゴシック"/>
         </w:rPr>
         <w:t>dbo</w:t>
       </w:r>
+      <w:proofErr w:type="spellEnd"/>
       <w:r>
         <w:rPr>
           <w:rFonts w:ascii="ＭＳ Ｐゴシック" w:eastAsia="ＭＳ Ｐゴシック" w:hAnsi="ＭＳ Ｐゴシック"/>
@@ -2603,12 +2739,14 @@
           <w:rFonts w:ascii="ＭＳ Ｐゴシック" w:eastAsia="ＭＳ Ｐゴシック" w:hAnsi="ＭＳ Ｐゴシック"/>
         </w:rPr>
       </w:pPr>
+      <w:proofErr w:type="spellStart"/>
       <w:r>
         <w:rPr>
           <w:rFonts w:ascii="ＭＳ Ｐゴシック" w:eastAsia="ＭＳ Ｐゴシック" w:hAnsi="ＭＳ Ｐゴシック"/>
         </w:rPr>
         <w:t>dbo</w:t>
       </w:r>
+      <w:proofErr w:type="spellEnd"/>
       <w:r>
         <w:rPr>
           <w:rFonts w:ascii="ＭＳ Ｐゴシック" w:eastAsia="ＭＳ Ｐゴシック" w:hAnsi="ＭＳ Ｐゴシック"/>
@@ -2623,12 +2761,14 @@
           <w:rFonts w:ascii="ＭＳ Ｐゴシック" w:eastAsia="ＭＳ Ｐゴシック" w:hAnsi="ＭＳ Ｐゴシック"/>
         </w:rPr>
       </w:pPr>
+      <w:proofErr w:type="spellStart"/>
       <w:r>
         <w:rPr>
           <w:rFonts w:ascii="ＭＳ Ｐゴシック" w:eastAsia="ＭＳ Ｐゴシック" w:hAnsi="ＭＳ Ｐゴシック"/>
         </w:rPr>
         <w:t>dbo</w:t>
       </w:r>
+      <w:proofErr w:type="spellEnd"/>
       <w:r>
         <w:rPr>
           <w:rFonts w:ascii="ＭＳ Ｐゴシック" w:eastAsia="ＭＳ Ｐゴシック" w:hAnsi="ＭＳ Ｐゴシック"/>
@@ -2643,32 +2783,43 @@
           <w:rFonts w:ascii="ＭＳ Ｐゴシック" w:eastAsia="ＭＳ Ｐゴシック" w:hAnsi="ＭＳ Ｐゴシック"/>
         </w:rPr>
       </w:pPr>
+      <w:proofErr w:type="spellStart"/>
       <w:r>
         <w:rPr>
           <w:rFonts w:ascii="ＭＳ Ｐゴシック" w:eastAsia="ＭＳ Ｐゴシック" w:hAnsi="ＭＳ Ｐゴシック"/>
         </w:rPr>
         <w:t>dbo</w:t>
       </w:r>
+      <w:proofErr w:type="spellEnd"/>
       <w:r>
         <w:rPr>
           <w:rFonts w:ascii="ＭＳ Ｐゴシック" w:eastAsia="ＭＳ Ｐゴシック" w:hAnsi="ＭＳ Ｐゴシック"/>
         </w:rPr>
         <w:tab/>
+      </w:r>
+      <w:proofErr w:type="spellStart"/>
+      <w:r>
+        <w:rPr>
+          <w:rFonts w:ascii="ＭＳ Ｐゴシック" w:eastAsia="ＭＳ Ｐゴシック" w:hAnsi="ＭＳ Ｐゴシック"/>
+        </w:rPr>
         <w:t>tax_codes</w:t>
       </w:r>
-    </w:p>
-    <w:p>
-      <w:pPr>
-        <w:rPr>
-          <w:rFonts w:ascii="ＭＳ Ｐゴシック" w:eastAsia="ＭＳ Ｐゴシック" w:hAnsi="ＭＳ Ｐゴシック"/>
-        </w:rPr>
-      </w:pPr>
+      <w:proofErr w:type="spellEnd"/>
+    </w:p>
+    <w:p>
+      <w:pPr>
+        <w:rPr>
+          <w:rFonts w:ascii="ＭＳ Ｐゴシック" w:eastAsia="ＭＳ Ｐゴシック" w:hAnsi="ＭＳ Ｐゴシック"/>
+        </w:rPr>
+      </w:pPr>
+      <w:proofErr w:type="spellStart"/>
       <w:r>
         <w:rPr>
           <w:rFonts w:ascii="ＭＳ Ｐゴシック" w:eastAsia="ＭＳ Ｐゴシック" w:hAnsi="ＭＳ Ｐゴシック"/>
         </w:rPr>
         <w:t>dbo</w:t>
       </w:r>
+      <w:proofErr w:type="spellEnd"/>
       <w:r>
         <w:rPr>
           <w:rFonts w:ascii="ＭＳ Ｐゴシック" w:eastAsia="ＭＳ Ｐゴシック" w:hAnsi="ＭＳ Ｐゴシック"/>
@@ -2786,19 +2937,34 @@
         <w:rPr>
           <w:rFonts w:ascii="ＭＳ Ｐゴシック" w:eastAsia="ＭＳ Ｐゴシック" w:hAnsi="ＭＳ Ｐゴシック"/>
         </w:rPr>
-        <w:t>$desktop = [Environment]::GetFolderPath("Desktop")</w:t>
-      </w:r>
-    </w:p>
-    <w:p>
-      <w:pPr>
-        <w:rPr>
-          <w:rFonts w:ascii="ＭＳ Ｐゴシック" w:eastAsia="ＭＳ Ｐゴシック" w:hAnsi="ＭＳ Ｐゴシック"/>
-        </w:rPr>
-      </w:pPr>
-      <w:r>
-        <w:rPr>
-          <w:rFonts w:ascii="ＭＳ Ｐゴシック" w:eastAsia="ＭＳ Ｐゴシック" w:hAnsi="ＭＳ Ｐゴシック"/>
-        </w:rPr>
+        <w:t>$desktop = [Environment]::</w:t>
+      </w:r>
+      <w:proofErr w:type="spellStart"/>
+      <w:r>
+        <w:rPr>
+          <w:rFonts w:ascii="ＭＳ Ｐゴシック" w:eastAsia="ＭＳ Ｐゴシック" w:hAnsi="ＭＳ Ｐゴシック"/>
+        </w:rPr>
+        <w:t>GetFolderPath</w:t>
+      </w:r>
+      <w:proofErr w:type="spellEnd"/>
+      <w:r>
+        <w:rPr>
+          <w:rFonts w:ascii="ＭＳ Ｐゴシック" w:eastAsia="ＭＳ Ｐゴシック" w:hAnsi="ＭＳ Ｐゴシック"/>
+        </w:rPr>
+        <w:t>("Desktop")</w:t>
+      </w:r>
+    </w:p>
+    <w:p>
+      <w:pPr>
+        <w:rPr>
+          <w:rFonts w:ascii="ＭＳ Ｐゴシック" w:eastAsia="ＭＳ Ｐゴシック" w:hAnsi="ＭＳ Ｐゴシック"/>
+        </w:rPr>
+      </w:pPr>
+      <w:r>
+        <w:rPr>
+          <w:rFonts w:ascii="ＭＳ Ｐゴシック" w:eastAsia="ＭＳ Ｐゴシック" w:hAnsi="ＭＳ Ｐゴシック"/>
+        </w:rPr>
+        <w:lastRenderedPageBreak/>
         <w:t>$bat = Join-Path $desktop "会計システム.bat"</w:t>
       </w:r>
     </w:p>
@@ -2845,8 +3011,16 @@
         <w:rPr>
           <w:rFonts w:ascii="ＭＳ Ｐゴシック" w:eastAsia="ＭＳ Ｐゴシック" w:hAnsi="ＭＳ Ｐゴシック"/>
         </w:rPr>
-        <w:t>title AccountingFirstSuccess</w:t>
-      </w:r>
+        <w:t xml:space="preserve">title </w:t>
+      </w:r>
+      <w:proofErr w:type="spellStart"/>
+      <w:r>
+        <w:rPr>
+          <w:rFonts w:ascii="ＭＳ Ｐゴシック" w:eastAsia="ＭＳ Ｐゴシック" w:hAnsi="ＭＳ Ｐゴシック"/>
+        </w:rPr>
+        <w:t>AccountingFirstSuccess</w:t>
+      </w:r>
+      <w:proofErr w:type="spellEnd"/>
     </w:p>
     <w:p>
       <w:pPr>
@@ -2871,34 +3045,683 @@
         <w:rPr>
           <w:rFonts w:ascii="ＭＳ Ｐゴシック" w:eastAsia="ＭＳ Ｐゴシック" w:hAnsi="ＭＳ Ｐゴシック"/>
         </w:rPr>
-        <w:t>"C:\Program Files\nodejs\node.exe" --env-file=.env server.js</w:t>
-      </w:r>
-    </w:p>
-    <w:p>
-      <w:pPr>
-        <w:rPr>
-          <w:rFonts w:ascii="ＭＳ Ｐゴシック" w:eastAsia="ＭＳ Ｐゴシック" w:hAnsi="ＭＳ Ｐゴシック"/>
-        </w:rPr>
-      </w:pPr>
-      <w:r>
-        <w:rPr>
-          <w:rFonts w:ascii="ＭＳ Ｐゴシック" w:eastAsia="ＭＳ Ｐゴシック" w:hAnsi="ＭＳ Ｐゴシック"/>
+        <w:t>"C:\Program Files\</w:t>
+      </w:r>
+      <w:proofErr w:type="spellStart"/>
+      <w:r>
+        <w:rPr>
+          <w:rFonts w:ascii="ＭＳ Ｐゴシック" w:eastAsia="ＭＳ Ｐゴシック" w:hAnsi="ＭＳ Ｐゴシック"/>
+        </w:rPr>
+        <w:t>nodejs</w:t>
+      </w:r>
+      <w:proofErr w:type="spellEnd"/>
+      <w:r>
+        <w:rPr>
+          <w:rFonts w:ascii="ＭＳ Ｐゴシック" w:eastAsia="ＭＳ Ｐゴシック" w:hAnsi="ＭＳ Ｐゴシック"/>
+        </w:rPr>
+        <w:t>\node.exe" --env-file=.env server.js</w:t>
+      </w:r>
+    </w:p>
+    <w:p>
+      <w:pPr>
+        <w:rPr>
+          <w:rFonts w:ascii="ＭＳ Ｐゴシック" w:eastAsia="ＭＳ Ｐゴシック" w:hAnsi="ＭＳ Ｐゴシック"/>
+        </w:rPr>
+      </w:pPr>
+      <w:r>
+        <w:rPr>
+          <w:rFonts w:ascii="ＭＳ Ｐゴシック" w:eastAsia="ＭＳ Ｐゴシック" w:hAnsi="ＭＳ Ｐゴシック"/>
+        </w:rPr>
+        <w:t>pause</w:t>
+      </w:r>
+    </w:p>
+    <w:p>
+      <w:pPr>
+        <w:rPr>
+          <w:rFonts w:ascii="ＭＳ Ｐゴシック" w:eastAsia="ＭＳ Ｐゴシック" w:hAnsi="ＭＳ Ｐゴシック"/>
+        </w:rPr>
+      </w:pPr>
+      <w:r>
+        <w:rPr>
+          <w:rFonts w:ascii="ＭＳ Ｐゴシック" w:eastAsia="ＭＳ Ｐゴシック" w:hAnsi="ＭＳ Ｐゴシック"/>
+        </w:rPr>
+        <w:t>'@ | Set-Content -Path $bat -Encoding ASCII</w:t>
+      </w:r>
+    </w:p>
+    <w:p>
+      <w:pPr>
+        <w:rPr>
+          <w:rFonts w:ascii="ＭＳ Ｐゴシック" w:eastAsia="ＭＳ Ｐゴシック" w:hAnsi="ＭＳ Ｐゴシック"/>
+        </w:rPr>
+      </w:pPr>
+    </w:p>
+    <w:p>
+      <w:pPr>
+        <w:rPr>
+          <w:rFonts w:ascii="ＭＳ Ｐゴシック" w:eastAsia="ＭＳ Ｐゴシック" w:hAnsi="ＭＳ Ｐゴシック"/>
+        </w:rPr>
+      </w:pPr>
+      <w:r>
+        <w:rPr>
+          <w:rFonts w:ascii="ＭＳ Ｐゴシック" w:eastAsia="ＭＳ Ｐゴシック" w:hAnsi="ＭＳ Ｐゴシック" w:hint="eastAsia"/>
+        </w:rPr>
+        <w:t>１７．データベースバックアップはSQL Serverで行い、障害発生時のデータベースの戻しはSQL Serverで行うことを想定しています。</w:t>
+      </w:r>
+    </w:p>
+    <w:p>
+      <w:pPr>
+        <w:rPr>
+          <w:rFonts w:ascii="ＭＳ Ｐゴシック" w:eastAsia="ＭＳ Ｐゴシック" w:hAnsi="ＭＳ Ｐゴシック"/>
+        </w:rPr>
+      </w:pPr>
+      <w:r>
+        <w:rPr>
+          <w:rFonts w:ascii="ＭＳ Ｐゴシック" w:eastAsia="ＭＳ Ｐゴシック" w:hAnsi="ＭＳ Ｐゴシック" w:hint="eastAsia"/>
+        </w:rPr>
+        <w:t>定期的にSQL Serverからバックアップファイルの取得を行ってください。</w:t>
+      </w:r>
+    </w:p>
+    <w:p>
+      <w:pPr>
+        <w:widowControl/>
+        <w:jc w:val="left"/>
+        <w:rPr>
+          <w:rFonts w:ascii="ＭＳ Ｐゴシック" w:eastAsia="ＭＳ Ｐゴシック" w:hAnsi="ＭＳ Ｐゴシック"/>
+        </w:rPr>
+      </w:pPr>
+      <w:r>
+        <w:rPr>
+          <w:rFonts w:ascii="ＭＳ Ｐゴシック" w:eastAsia="ＭＳ Ｐゴシック" w:hAnsi="ＭＳ Ｐゴシック"/>
+        </w:rPr>
+        <w:br w:type="page"/>
+      </w:r>
+    </w:p>
+    <w:p>
+      <w:pPr>
+        <w:rPr>
+          <w:rFonts w:ascii="ＭＳ Ｐゴシック" w:eastAsia="ＭＳ Ｐゴシック" w:hAnsi="ＭＳ Ｐゴシック"/>
+          <w:b/>
+          <w:bCs/>
+        </w:rPr>
+      </w:pPr>
+      <w:r>
+        <w:rPr>
+          <w:rFonts w:ascii="ＭＳ Ｐゴシック" w:eastAsia="ＭＳ Ｐゴシック" w:hAnsi="ＭＳ Ｐゴシック"/>
+          <w:b/>
+          <w:bCs/>
         </w:rPr>
         <w:lastRenderedPageBreak/>
-        <w:t>pause</w:t>
-      </w:r>
-    </w:p>
-    <w:p>
-      <w:pPr>
-        <w:rPr>
-          <w:rFonts w:ascii="ＭＳ Ｐゴシック" w:eastAsia="ＭＳ Ｐゴシック" w:hAnsi="ＭＳ Ｐゴシック"/>
-        </w:rPr>
-      </w:pPr>
-      <w:r>
-        <w:rPr>
-          <w:rFonts w:ascii="ＭＳ Ｐゴシック" w:eastAsia="ＭＳ Ｐゴシック" w:hAnsi="ＭＳ Ｐゴシック"/>
-        </w:rPr>
-        <w:t>'@ | Set-Content -Path $bat -Encoding ASCII</w:t>
+        <w:t>会計帳簿 (Accounting / First Success)</w:t>
+      </w:r>
+    </w:p>
+    <w:p>
+      <w:pPr>
+        <w:rPr>
+          <w:rFonts w:ascii="ＭＳ Ｐゴシック" w:eastAsia="ＭＳ Ｐゴシック" w:hAnsi="ＭＳ Ｐゴシック"/>
+          <w:b/>
+          <w:bCs/>
+          <w:u w:val="single"/>
+        </w:rPr>
+      </w:pPr>
+      <w:r>
+        <w:rPr>
+          <w:rFonts w:ascii="ＭＳ Ｐゴシック" w:eastAsia="ＭＳ Ｐゴシック" w:hAnsi="ＭＳ Ｐゴシック"/>
+          <w:b/>
+          <w:bCs/>
+          <w:u w:val="single"/>
+        </w:rPr>
+        <w:t>免責事項（Disclaimer）</w:t>
+      </w:r>
+    </w:p>
+    <w:p>
+      <w:pPr>
+        <w:rPr>
+          <w:rFonts w:ascii="ＭＳ Ｐゴシック" w:eastAsia="ＭＳ Ｐゴシック" w:hAnsi="ＭＳ Ｐゴシック"/>
+          <w:b/>
+          <w:bCs/>
+        </w:rPr>
+      </w:pPr>
+    </w:p>
+    <w:p>
+      <w:pPr>
+        <w:rPr>
+          <w:rFonts w:ascii="ＭＳ Ｐゴシック" w:eastAsia="ＭＳ Ｐゴシック" w:hAnsi="ＭＳ Ｐゴシック"/>
+          <w:b/>
+          <w:bCs/>
+        </w:rPr>
+      </w:pPr>
+      <w:r>
+        <w:rPr>
+          <w:rFonts w:ascii="ＭＳ Ｐゴシック" w:eastAsia="ＭＳ Ｐゴシック" w:hAnsi="ＭＳ Ｐゴシック"/>
+          <w:b/>
+          <w:bCs/>
+        </w:rPr>
+        <w:t>第1条（本ソフトウェアの提供）</w:t>
+      </w:r>
+    </w:p>
+    <w:p>
+      <w:pPr>
+        <w:rPr>
+          <w:rFonts w:ascii="ＭＳ Ｐゴシック" w:eastAsia="ＭＳ Ｐゴシック" w:hAnsi="ＭＳ Ｐゴシック"/>
+        </w:rPr>
+      </w:pPr>
+      <w:r>
+        <w:rPr>
+          <w:rFonts w:ascii="ＭＳ Ｐゴシック" w:eastAsia="ＭＳ Ｐゴシック" w:hAnsi="ＭＳ Ｐゴシック"/>
+        </w:rPr>
+        <w:t>会計帳簿 (Accounting / First Success)（以下「本ソフトウェア」といいます）は、仕訳入力、会計帳簿の作成・管理、勘定科目の集計、試算表、貸借対照表、損益計算書その他の会計情報の作成・管理を支援することを目的としたソフトウェアです。</w:t>
+      </w:r>
+    </w:p>
+    <w:p>
+      <w:pPr>
+        <w:rPr>
+          <w:rFonts w:ascii="ＭＳ Ｐゴシック" w:eastAsia="ＭＳ Ｐゴシック" w:hAnsi="ＭＳ Ｐゴシック"/>
+        </w:rPr>
+      </w:pPr>
+      <w:r>
+        <w:rPr>
+          <w:rFonts w:ascii="ＭＳ Ｐゴシック" w:eastAsia="ＭＳ Ｐゴシック" w:hAnsi="ＭＳ Ｐゴシック"/>
+        </w:rPr>
+        <w:t>本ソフトウェアは、現状有姿（AS IS）で提供されます。</w:t>
+      </w:r>
+    </w:p>
+    <w:p>
+      <w:pPr>
+        <w:rPr>
+          <w:rFonts w:ascii="ＭＳ Ｐゴシック" w:eastAsia="ＭＳ Ｐゴシック" w:hAnsi="ＭＳ Ｐゴシック"/>
+        </w:rPr>
+      </w:pPr>
+      <w:r>
+        <w:rPr>
+          <w:rFonts w:ascii="ＭＳ Ｐゴシック" w:eastAsia="ＭＳ Ｐゴシック" w:hAnsi="ＭＳ Ｐゴシック"/>
+        </w:rPr>
+        <w:t>本ソフトウェアの開発者および提供者（以下「提供者」といいます）は、本ソフトウェアの正確性、完全性、信頼性、安全性、有用性、特定目的への適合性、商品性および継続的な利用可能性について、明示または黙示を問わず、保証しません。</w:t>
+      </w:r>
+    </w:p>
+    <w:p>
+      <w:pPr>
+        <w:rPr>
+          <w:rFonts w:ascii="ＭＳ Ｐゴシック" w:eastAsia="ＭＳ Ｐゴシック" w:hAnsi="ＭＳ Ｐゴシック"/>
+          <w:b/>
+          <w:bCs/>
+        </w:rPr>
+      </w:pPr>
+      <w:r>
+        <w:rPr>
+          <w:rFonts w:ascii="ＭＳ Ｐゴシック" w:eastAsia="ＭＳ Ｐゴシック" w:hAnsi="ＭＳ Ｐゴシック"/>
+          <w:b/>
+          <w:bCs/>
+        </w:rPr>
+        <w:t>第2条（会計処理および計算結果）</w:t>
+      </w:r>
+    </w:p>
+    <w:p>
+      <w:pPr>
+        <w:rPr>
+          <w:rFonts w:ascii="ＭＳ Ｐゴシック" w:eastAsia="ＭＳ Ｐゴシック" w:hAnsi="ＭＳ Ｐゴシック"/>
+        </w:rPr>
+      </w:pPr>
+      <w:r>
+        <w:rPr>
+          <w:rFonts w:ascii="ＭＳ Ｐゴシック" w:eastAsia="ＭＳ Ｐゴシック" w:hAnsi="ＭＳ Ｐゴシック"/>
+        </w:rPr>
+        <w:t>本ソフトウェアによる仕訳処理、勘定科目の集計、残高計算、試算表、貸借対照表、損益計算書その他の帳票および計算結果について、提供者は、その正確性、完全性および会計基準への適合性を保証しません。</w:t>
+      </w:r>
+    </w:p>
+    <w:p>
+      <w:pPr>
+        <w:rPr>
+          <w:rFonts w:ascii="ＭＳ Ｐゴシック" w:eastAsia="ＭＳ Ｐゴシック" w:hAnsi="ＭＳ Ｐゴシック"/>
+        </w:rPr>
+      </w:pPr>
+      <w:r>
+        <w:rPr>
+          <w:rFonts w:ascii="ＭＳ Ｐゴシック" w:eastAsia="ＭＳ Ｐゴシック" w:hAnsi="ＭＳ Ｐゴシック"/>
+        </w:rPr>
+        <w:t>利用者は、入力内容、会計処理および出力結果を自らの責任において確認するものとします。</w:t>
+      </w:r>
+    </w:p>
+    <w:p>
+      <w:pPr>
+        <w:rPr>
+          <w:rFonts w:ascii="ＭＳ Ｐゴシック" w:eastAsia="ＭＳ Ｐゴシック" w:hAnsi="ＭＳ Ｐゴシック"/>
+        </w:rPr>
+      </w:pPr>
+      <w:r>
+        <w:rPr>
+          <w:rFonts w:ascii="ＭＳ Ｐゴシック" w:eastAsia="ＭＳ Ｐゴシック" w:hAnsi="ＭＳ Ｐゴシック"/>
+        </w:rPr>
+        <w:t>必要に応じて、税理士、公認会計士その他の専門家に相談してください。</w:t>
+      </w:r>
+    </w:p>
+    <w:p>
+      <w:pPr>
+        <w:rPr>
+          <w:rFonts w:ascii="ＭＳ Ｐゴシック" w:eastAsia="ＭＳ Ｐゴシック" w:hAnsi="ＭＳ Ｐゴシック"/>
+          <w:b/>
+          <w:bCs/>
+        </w:rPr>
+      </w:pPr>
+      <w:r>
+        <w:rPr>
+          <w:rFonts w:ascii="ＭＳ Ｐゴシック" w:eastAsia="ＭＳ Ｐゴシック" w:hAnsi="ＭＳ Ｐゴシック"/>
+          <w:b/>
+          <w:bCs/>
+        </w:rPr>
+        <w:t>第3条（税務申告および法令への適合）</w:t>
+      </w:r>
+    </w:p>
+    <w:p>
+      <w:pPr>
+        <w:rPr>
+          <w:rFonts w:ascii="ＭＳ Ｐゴシック" w:eastAsia="ＭＳ Ｐゴシック" w:hAnsi="ＭＳ Ｐゴシック"/>
+        </w:rPr>
+      </w:pPr>
+      <w:r>
+        <w:rPr>
+          <w:rFonts w:ascii="ＭＳ Ｐゴシック" w:eastAsia="ＭＳ Ｐゴシック" w:hAnsi="ＭＳ Ｐゴシック"/>
+        </w:rPr>
+        <w:t>本ソフトウェアは、税務申告、決算書の提出、法定帳簿の作成・保存その他の法的義務への適合を保証するものではありません。</w:t>
+      </w:r>
+    </w:p>
+    <w:p>
+      <w:pPr>
+        <w:rPr>
+          <w:rFonts w:ascii="ＭＳ Ｐゴシック" w:eastAsia="ＭＳ Ｐゴシック" w:hAnsi="ＭＳ Ｐゴシック"/>
+        </w:rPr>
+      </w:pPr>
+      <w:r>
+        <w:rPr>
+          <w:rFonts w:ascii="ＭＳ Ｐゴシック" w:eastAsia="ＭＳ Ｐゴシック" w:hAnsi="ＭＳ Ｐゴシック"/>
+        </w:rPr>
+        <w:t>また、税法、会社法、会計基準、電子帳簿保存法その他の法令・制度の制定、改正および解釈の変更に対し、常に最新の対応が行われることを保証しません。</w:t>
+      </w:r>
+    </w:p>
+    <w:p>
+      <w:pPr>
+        <w:rPr>
+          <w:rFonts w:ascii="ＭＳ Ｐゴシック" w:eastAsia="ＭＳ Ｐゴシック" w:hAnsi="ＭＳ Ｐゴシック"/>
+        </w:rPr>
+      </w:pPr>
+      <w:r>
+        <w:rPr>
+          <w:rFonts w:ascii="ＭＳ Ｐゴシック" w:eastAsia="ＭＳ Ｐゴシック" w:hAnsi="ＭＳ Ｐゴシック"/>
+        </w:rPr>
+        <w:t>利用者は、適用される法令および会計基準への適合性を自ら確認するものとします。</w:t>
+      </w:r>
+    </w:p>
+    <w:p>
+      <w:pPr>
+        <w:rPr>
+          <w:rFonts w:ascii="ＭＳ Ｐゴシック" w:eastAsia="ＭＳ Ｐゴシック" w:hAnsi="ＭＳ Ｐゴシック"/>
+          <w:b/>
+          <w:bCs/>
+        </w:rPr>
+      </w:pPr>
+      <w:r>
+        <w:rPr>
+          <w:rFonts w:ascii="ＭＳ Ｐゴシック" w:eastAsia="ＭＳ Ｐゴシック" w:hAnsi="ＭＳ Ｐゴシック"/>
+          <w:b/>
+          <w:bCs/>
+        </w:rPr>
+        <w:t>第4条（データの保存およびバックアップ）</w:t>
+      </w:r>
+    </w:p>
+    <w:p>
+      <w:pPr>
+        <w:rPr>
+          <w:rFonts w:ascii="ＭＳ Ｐゴシック" w:eastAsia="ＭＳ Ｐゴシック" w:hAnsi="ＭＳ Ｐゴシック"/>
+        </w:rPr>
+      </w:pPr>
+      <w:r>
+        <w:rPr>
+          <w:rFonts w:ascii="ＭＳ Ｐゴシック" w:eastAsia="ＭＳ Ｐゴシック" w:hAnsi="ＭＳ Ｐゴシック"/>
+        </w:rPr>
+        <w:t>利用者は、本ソフトウェアで管理する仕訳データ、会計帳簿、データベース、設定情報その他の重要な情報について、自らの責任において適切なバックアップおよび復元手段を確保するものとします。</w:t>
+      </w:r>
+    </w:p>
+    <w:p>
+      <w:pPr>
+        <w:rPr>
+          <w:rFonts w:ascii="ＭＳ Ｐゴシック" w:eastAsia="ＭＳ Ｐゴシック" w:hAnsi="ＭＳ Ｐゴシック"/>
+        </w:rPr>
+      </w:pPr>
+      <w:r>
+        <w:rPr>
+          <w:rFonts w:ascii="ＭＳ Ｐゴシック" w:eastAsia="ＭＳ Ｐゴシック" w:hAnsi="ＭＳ Ｐゴシック"/>
+        </w:rPr>
+        <w:t>提供者は、ソフトウェアの不具合、データベース障害、ハードウェア障害、操作ミス、外部サービスの障害、不正アクセスその他の原因によるデータの消失、破損、改変、漏えいまたは復元不能が発生しないことを保証しません。</w:t>
+      </w:r>
+    </w:p>
+    <w:p>
+      <w:pPr>
+        <w:rPr>
+          <w:rFonts w:ascii="ＭＳ Ｐゴシック" w:eastAsia="ＭＳ Ｐゴシック" w:hAnsi="ＭＳ Ｐゴシック"/>
+          <w:b/>
+          <w:bCs/>
+        </w:rPr>
+      </w:pPr>
+      <w:r>
+        <w:rPr>
+          <w:rFonts w:ascii="ＭＳ Ｐゴシック" w:eastAsia="ＭＳ Ｐゴシック" w:hAnsi="ＭＳ Ｐゴシック"/>
+          <w:b/>
+          <w:bCs/>
+        </w:rPr>
+        <w:t>第5条（セキュリティ）</w:t>
+      </w:r>
+    </w:p>
+    <w:p>
+      <w:pPr>
+        <w:rPr>
+          <w:rFonts w:ascii="ＭＳ Ｐゴシック" w:eastAsia="ＭＳ Ｐゴシック" w:hAnsi="ＭＳ Ｐゴシック"/>
+        </w:rPr>
+      </w:pPr>
+      <w:r>
+        <w:rPr>
+          <w:rFonts w:ascii="ＭＳ Ｐゴシック" w:eastAsia="ＭＳ Ｐゴシック" w:hAnsi="ＭＳ Ｐゴシック"/>
+        </w:rPr>
+        <w:t>提供者は、本ソフトウェアに脆弱性、不具合、セキュリティ上の欠陥または悪意ある第三者による攻撃の危険性が存在しないことを保証しません。</w:t>
+      </w:r>
+    </w:p>
+    <w:p>
+      <w:pPr>
+        <w:rPr>
+          <w:rFonts w:ascii="ＭＳ Ｐゴシック" w:eastAsia="ＭＳ Ｐゴシック" w:hAnsi="ＭＳ Ｐゴシック"/>
+        </w:rPr>
+      </w:pPr>
+      <w:r>
+        <w:rPr>
+          <w:rFonts w:ascii="ＭＳ Ｐゴシック" w:eastAsia="ＭＳ Ｐゴシック" w:hAnsi="ＭＳ Ｐゴシック"/>
+        </w:rPr>
+        <w:t>利用者は、認証情報の管理、アクセス権限の設定、ネットワークの保護、ソフトウェアの更新、バックアップその他の必要なセキュリティ対策を自らの責任において実施するものとします。</w:t>
+      </w:r>
+    </w:p>
+    <w:p>
+      <w:pPr>
+        <w:rPr>
+          <w:rFonts w:ascii="ＭＳ Ｐゴシック" w:eastAsia="ＭＳ Ｐゴシック" w:hAnsi="ＭＳ Ｐゴシック"/>
+          <w:b/>
+          <w:bCs/>
+        </w:rPr>
+      </w:pPr>
+      <w:r>
+        <w:rPr>
+          <w:rFonts w:ascii="ＭＳ Ｐゴシック" w:eastAsia="ＭＳ Ｐゴシック" w:hAnsi="ＭＳ Ｐゴシック"/>
+          <w:b/>
+          <w:bCs/>
+        </w:rPr>
+        <w:t>第6条（損害賠償責任の制限）</w:t>
+      </w:r>
+    </w:p>
+    <w:p>
+      <w:pPr>
+        <w:rPr>
+          <w:rFonts w:ascii="ＭＳ Ｐゴシック" w:eastAsia="ＭＳ Ｐゴシック" w:hAnsi="ＭＳ Ｐゴシック"/>
+        </w:rPr>
+      </w:pPr>
+      <w:r>
+        <w:rPr>
+          <w:rFonts w:ascii="ＭＳ Ｐゴシック" w:eastAsia="ＭＳ Ｐゴシック" w:hAnsi="ＭＳ Ｐゴシック"/>
+        </w:rPr>
+        <w:t>提供者は、本ソフトウェアの利用または利用不能に関連して利用者または第三者に生じた損害について、適用法令により認められる範囲で責任を負わないものとします。</w:t>
+      </w:r>
+    </w:p>
+    <w:p>
+      <w:pPr>
+        <w:rPr>
+          <w:rFonts w:ascii="ＭＳ Ｐゴシック" w:eastAsia="ＭＳ Ｐゴシック" w:hAnsi="ＭＳ Ｐゴシック"/>
+        </w:rPr>
+      </w:pPr>
+      <w:r>
+        <w:rPr>
+          <w:rFonts w:ascii="ＭＳ Ｐゴシック" w:eastAsia="ＭＳ Ｐゴシック" w:hAnsi="ＭＳ Ｐゴシック"/>
+        </w:rPr>
+        <w:lastRenderedPageBreak/>
+        <w:t>対象となる損害には、会計処理・計算結果の誤り、税務申告の誤り、データの消失・破損、業務の中断、逸失利益、信用の毀損、第三者からの請求その他の直接的または間接的な損害を含みます。</w:t>
+      </w:r>
+    </w:p>
+    <w:p>
+      <w:pPr>
+        <w:rPr>
+          <w:rFonts w:ascii="ＭＳ Ｐゴシック" w:eastAsia="ＭＳ Ｐゴシック" w:hAnsi="ＭＳ Ｐゴシック"/>
+        </w:rPr>
+      </w:pPr>
+      <w:r>
+        <w:rPr>
+          <w:rFonts w:ascii="ＭＳ Ｐゴシック" w:eastAsia="ＭＳ Ｐゴシック" w:hAnsi="ＭＳ Ｐゴシック"/>
+        </w:rPr>
+        <w:t>ただし、提供者の故意または重大な過失による場合その他、適用法令により免責または責任制限が認められない場合には、この限りではありません。</w:t>
+      </w:r>
+    </w:p>
+    <w:p>
+      <w:pPr>
+        <w:rPr>
+          <w:rFonts w:ascii="ＭＳ Ｐゴシック" w:eastAsia="ＭＳ Ｐゴシック" w:hAnsi="ＭＳ Ｐゴシック"/>
+          <w:b/>
+          <w:bCs/>
+        </w:rPr>
+      </w:pPr>
+      <w:r>
+        <w:rPr>
+          <w:rFonts w:ascii="ＭＳ Ｐゴシック" w:eastAsia="ＭＳ Ｐゴシック" w:hAnsi="ＭＳ Ｐゴシック"/>
+          <w:b/>
+          <w:bCs/>
+        </w:rPr>
+        <w:t>第7条（保守、更新およびサポート）</w:t>
+      </w:r>
+    </w:p>
+    <w:p>
+      <w:pPr>
+        <w:rPr>
+          <w:rFonts w:ascii="ＭＳ Ｐゴシック" w:eastAsia="ＭＳ Ｐゴシック" w:hAnsi="ＭＳ Ｐゴシック"/>
+        </w:rPr>
+      </w:pPr>
+      <w:r>
+        <w:rPr>
+          <w:rFonts w:ascii="ＭＳ Ｐゴシック" w:eastAsia="ＭＳ Ｐゴシック" w:hAnsi="ＭＳ Ｐゴシック"/>
+        </w:rPr>
+        <w:t>提供者は、別途明示的に約束した場合を除き、本ソフトウェアの保守、更新、不具合修正、機能追加、技術サポートおよび継続的な提供について義務を負いません。</w:t>
+      </w:r>
+    </w:p>
+    <w:p>
+      <w:pPr>
+        <w:rPr>
+          <w:rFonts w:ascii="ＭＳ Ｐゴシック" w:eastAsia="ＭＳ Ｐゴシック" w:hAnsi="ＭＳ Ｐゴシック"/>
+        </w:rPr>
+      </w:pPr>
+      <w:r>
+        <w:rPr>
+          <w:rFonts w:ascii="ＭＳ Ｐゴシック" w:eastAsia="ＭＳ Ｐゴシック" w:hAnsi="ＭＳ Ｐゴシック"/>
+        </w:rPr>
+        <w:t>提供者は、必要に応じて本ソフトウェアの仕様変更、機能の追加・削除、開発の中断または提供の終了を行うことがあります。</w:t>
+      </w:r>
+    </w:p>
+    <w:p>
+      <w:pPr>
+        <w:rPr>
+          <w:rFonts w:ascii="ＭＳ Ｐゴシック" w:eastAsia="ＭＳ Ｐゴシック" w:hAnsi="ＭＳ Ｐゴシック"/>
+          <w:b/>
+          <w:bCs/>
+        </w:rPr>
+      </w:pPr>
+      <w:r>
+        <w:rPr>
+          <w:rFonts w:ascii="ＭＳ Ｐゴシック" w:eastAsia="ＭＳ Ｐゴシック" w:hAnsi="ＭＳ Ｐゴシック"/>
+          <w:b/>
+          <w:bCs/>
+        </w:rPr>
+        <w:t>第8条（第三者ソフトウェア）</w:t>
+      </w:r>
+    </w:p>
+    <w:p>
+      <w:pPr>
+        <w:rPr>
+          <w:rFonts w:ascii="ＭＳ Ｐゴシック" w:eastAsia="ＭＳ Ｐゴシック" w:hAnsi="ＭＳ Ｐゴシック"/>
+        </w:rPr>
+      </w:pPr>
+      <w:r>
+        <w:rPr>
+          <w:rFonts w:ascii="ＭＳ Ｐゴシック" w:eastAsia="ＭＳ Ｐゴシック" w:hAnsi="ＭＳ Ｐゴシック"/>
+        </w:rPr>
+        <w:t>本ソフトウェアが利用するデータベース、ライブラリ、フレームワークその他の第三者ソフトウェアについては、それぞれの提供者が定めるライセンス条件および利用条件が適用されます。</w:t>
+      </w:r>
+    </w:p>
+    <w:p>
+      <w:pPr>
+        <w:rPr>
+          <w:rFonts w:ascii="ＭＳ Ｐゴシック" w:eastAsia="ＭＳ Ｐゴシック" w:hAnsi="ＭＳ Ｐゴシック"/>
+        </w:rPr>
+      </w:pPr>
+      <w:r>
+        <w:rPr>
+          <w:rFonts w:ascii="ＭＳ Ｐゴシック" w:eastAsia="ＭＳ Ｐゴシック" w:hAnsi="ＭＳ Ｐゴシック"/>
+        </w:rPr>
+        <w:t>提供者は、第三者ソフトウェアの動作、継続提供、品質および安全性について保証しません。</w:t>
+      </w:r>
+    </w:p>
+    <w:p>
+      <w:pPr>
+        <w:rPr>
+          <w:rFonts w:ascii="ＭＳ Ｐゴシック" w:eastAsia="ＭＳ Ｐゴシック" w:hAnsi="ＭＳ Ｐゴシック"/>
+          <w:b/>
+          <w:bCs/>
+        </w:rPr>
+      </w:pPr>
+      <w:r>
+        <w:rPr>
+          <w:rFonts w:ascii="ＭＳ Ｐゴシック" w:eastAsia="ＭＳ Ｐゴシック" w:hAnsi="ＭＳ Ｐゴシック"/>
+          <w:b/>
+          <w:bCs/>
+        </w:rPr>
+        <w:t>第9条（利用者の責任）</w:t>
+      </w:r>
+    </w:p>
+    <w:p>
+      <w:pPr>
+        <w:rPr>
+          <w:rFonts w:ascii="ＭＳ Ｐゴシック" w:eastAsia="ＭＳ Ｐゴシック" w:hAnsi="ＭＳ Ｐゴシック"/>
+        </w:rPr>
+      </w:pPr>
+      <w:r>
+        <w:rPr>
+          <w:rFonts w:ascii="ＭＳ Ｐゴシック" w:eastAsia="ＭＳ Ｐゴシック" w:hAnsi="ＭＳ Ｐゴシック"/>
+        </w:rPr>
+        <w:t>利用者は、本ソフトウェアの導入、設定、運用、入力データの管理、処理結果の確認、データのバックアップおよび法令への適合性の確認を、自らの責任において行うものとします。</w:t>
+      </w:r>
+    </w:p>
+    <w:p>
+      <w:pPr>
+        <w:rPr>
+          <w:rFonts w:ascii="ＭＳ Ｐゴシック" w:eastAsia="ＭＳ Ｐゴシック" w:hAnsi="ＭＳ Ｐゴシック"/>
+        </w:rPr>
+      </w:pPr>
+      <w:r>
+        <w:rPr>
+          <w:rFonts w:ascii="ＭＳ Ｐゴシック" w:eastAsia="ＭＳ Ｐゴシック" w:hAnsi="ＭＳ Ｐゴシック"/>
+        </w:rPr>
+        <w:t>本ソフトウェアの利用によって生じる結果については、適用法令に別段の定めがある場合を除き、利用者が責任を負うものとします。</w:t>
+      </w:r>
+    </w:p>
+    <w:p>
+      <w:pPr>
+        <w:rPr>
+          <w:rFonts w:ascii="ＭＳ Ｐゴシック" w:eastAsia="ＭＳ Ｐゴシック" w:hAnsi="ＭＳ Ｐゴシック"/>
+          <w:b/>
+          <w:bCs/>
+        </w:rPr>
+      </w:pPr>
+      <w:r>
+        <w:rPr>
+          <w:rFonts w:ascii="ＭＳ Ｐゴシック" w:eastAsia="ＭＳ Ｐゴシック" w:hAnsi="ＭＳ Ｐゴシック"/>
+          <w:b/>
+          <w:bCs/>
+        </w:rPr>
+        <w:t>第10条（免責事項の変更）</w:t>
+      </w:r>
+    </w:p>
+    <w:p>
+      <w:pPr>
+        <w:rPr>
+          <w:rFonts w:ascii="ＭＳ Ｐゴシック" w:eastAsia="ＭＳ Ｐゴシック" w:hAnsi="ＭＳ Ｐゴシック"/>
+        </w:rPr>
+      </w:pPr>
+      <w:r>
+        <w:rPr>
+          <w:rFonts w:ascii="ＭＳ Ｐゴシック" w:eastAsia="ＭＳ Ｐゴシック" w:hAnsi="ＭＳ Ｐゴシック"/>
+        </w:rPr>
+        <w:t>提供者は、必要に応じて本免責事項を変更することがあります。</w:t>
+      </w:r>
+    </w:p>
+    <w:p>
+      <w:pPr>
+        <w:rPr>
+          <w:rFonts w:ascii="ＭＳ Ｐゴシック" w:eastAsia="ＭＳ Ｐゴシック" w:hAnsi="ＭＳ Ｐゴシック"/>
+        </w:rPr>
+      </w:pPr>
+      <w:r>
+        <w:rPr>
+          <w:rFonts w:ascii="ＭＳ Ｐゴシック" w:eastAsia="ＭＳ Ｐゴシック" w:hAnsi="ＭＳ Ｐゴシック"/>
+        </w:rPr>
+        <w:t>変更後の免責事項は、本ソフトウェアの配布場所、公開Webサイトその他の適切な方法により公表するものとします。</w:t>
+      </w:r>
+    </w:p>
+    <w:p>
+      <w:pPr>
+        <w:rPr>
+          <w:rFonts w:ascii="ＭＳ Ｐゴシック" w:eastAsia="ＭＳ Ｐゴシック" w:hAnsi="ＭＳ Ｐゴシック"/>
+        </w:rPr>
+      </w:pPr>
+      <w:r>
+        <w:rPr>
+          <w:rFonts w:ascii="ＭＳ Ｐゴシック" w:eastAsia="ＭＳ Ｐゴシック" w:hAnsi="ＭＳ Ｐゴシック"/>
+        </w:rPr>
+        <w:pict w14:anchorId="08E0AA91">
+          <v:rect id="_x0000_i1025" style="width:0;height:1.5pt" o:hralign="center" o:hrstd="t" o:hr="t" fillcolor="#a0a0a0" stroked="f">
+            <v:textbox inset="5.85pt,.7pt,5.85pt,.7pt"/>
+          </v:rect>
+        </w:pict>
+      </w:r>
+    </w:p>
+    <w:p>
+      <w:pPr>
+        <w:rPr>
+          <w:rFonts w:ascii="ＭＳ Ｐゴシック" w:eastAsia="ＭＳ Ｐゴシック" w:hAnsi="ＭＳ Ｐゴシック"/>
+        </w:rPr>
+      </w:pPr>
+      <w:r>
+        <w:rPr>
+          <w:rFonts w:ascii="ＭＳ Ｐゴシック" w:eastAsia="ＭＳ Ｐゴシック" w:hAnsi="ＭＳ Ｐゴシック"/>
+          <w:b/>
+          <w:bCs/>
+        </w:rPr>
+        <w:t>ソフトウェア名：</w:t>
+      </w:r>
+      <w:r>
+        <w:rPr>
+          <w:rFonts w:ascii="ＭＳ Ｐゴシック" w:eastAsia="ＭＳ Ｐゴシック" w:hAnsi="ＭＳ Ｐゴシック"/>
+        </w:rPr>
+        <w:t xml:space="preserve"> 会計帳簿 (Accounting / First Success)</w:t>
+      </w:r>
+    </w:p>
+    <w:p>
+      <w:pPr>
+        <w:rPr>
+          <w:rFonts w:ascii="ＭＳ Ｐゴシック" w:eastAsia="ＭＳ Ｐゴシック" w:hAnsi="ＭＳ Ｐゴシック"/>
+        </w:rPr>
+      </w:pPr>
+      <w:r>
+        <w:rPr>
+          <w:rFonts w:ascii="ＭＳ Ｐゴシック" w:eastAsia="ＭＳ Ｐゴシック" w:hAnsi="ＭＳ Ｐゴシック"/>
+          <w:b/>
+          <w:bCs/>
+        </w:rPr>
+        <w:t>制定日：</w:t>
+      </w:r>
+      <w:r>
+        <w:rPr>
+          <w:rFonts w:ascii="ＭＳ Ｐゴシック" w:eastAsia="ＭＳ Ｐゴシック" w:hAnsi="ＭＳ Ｐゴシック"/>
+        </w:rPr>
+        <w:t xml:space="preserve"> 2026年10月12日</w:t>
       </w:r>
     </w:p>
     <w:p>
@@ -3870,6 +4693,18 @@
       </w:tblBorders>
     </w:tblPr>
   </w:style>
+  <w:style w:type="character" w:styleId="ad">
+    <w:name w:val="FollowedHyperlink"/>
+    <w:basedOn w:val="a0"/>
+    <w:uiPriority w:val="99"/>
+    <w:semiHidden/>
+    <w:unhideWhenUsed/>
+    <w:rsid w:val="00342CC8"/>
+    <w:rPr>
+      <w:color w:val="96607D" w:themeColor="followedHyperlink"/>
+      <w:u w:val="single"/>
+    </w:rPr>
+  </w:style>
 </w:styles>
 </file>
 

</xml_diff>

<commit_message>
Update Word documentation and Excel feature inventory
</commit_message>
<xml_diff>
--- a/readme.docx
+++ b/readme.docx
@@ -5,7 +5,7 @@
     <w:p>
       <w:pPr>
         <w:rPr>
-          <w:rFonts w:ascii="ＭＳ Ｐゴシック" w:eastAsia="ＭＳ Ｐゴシック" w:hAnsi="ＭＳ Ｐゴシック"/>
+          <w:rFonts w:ascii="ＭＳ Ｐゴシック" w:eastAsia="ＭＳ Ｐゴシック" w:hAnsi="ＭＳ Ｐゴシック" w:hint="eastAsia"/>
           <w:b/>
           <w:bCs/>
           <w:u w:val="single"/>
@@ -36,7 +36,29 @@
           <w:bCs/>
           <w:u w:val="single"/>
         </w:rPr>
-        <w:t>会計帳簿 （Accounting / First Success）</w:t>
+        <w:t xml:space="preserve">会計帳簿 </w:t>
+      </w:r>
+      <w:r>
+        <w:rPr>
+          <w:rFonts w:ascii="ＭＳ Ｐゴシック" w:eastAsia="ＭＳ Ｐゴシック" w:hAnsi="ＭＳ Ｐゴシック" w:hint="eastAsia"/>
+          <w:b/>
+          <w:bCs/>
+          <w:u w:val="single"/>
+        </w:rPr>
+        <w:t xml:space="preserve">　もんじゃ会計</w:t>
+      </w:r>
+    </w:p>
+    <w:p>
+      <w:pPr>
+        <w:rPr>
+          <w:rFonts w:ascii="ＭＳ Ｐゴシック" w:eastAsia="ＭＳ Ｐゴシック" w:hAnsi="ＭＳ Ｐゴシック" w:hint="eastAsia"/>
+        </w:rPr>
+      </w:pPr>
+      <w:r>
+        <w:rPr>
+          <w:rFonts w:ascii="ＭＳ Ｐゴシック" w:eastAsia="ＭＳ Ｐゴシック" w:hAnsi="ＭＳ Ｐゴシック" w:hint="eastAsia"/>
+        </w:rPr>
+        <w:t>Monja Accounting System by First Success</w:t>
       </w:r>
     </w:p>
     <w:p>
@@ -5004,23 +5026,6 @@
 </file>
 
 <file path=customXml/item1.xml><?xml version="1.0" encoding="utf-8"?>
-<p:properties xmlns:p="http://schemas.microsoft.com/office/2006/metadata/properties" xmlns:xsi="http://www.w3.org/2001/XMLSchema-instance" xmlns:pc="http://schemas.microsoft.com/office/infopath/2007/PartnerControls">
-  <documentManagement>
-    <_activity xmlns="3963c53f-597e-49f3-8825-2891d3039750" xsi:nil="true"/>
-  </documentManagement>
-</p:properties>
-</file>
-
-<file path=customXml/item2.xml><?xml version="1.0" encoding="utf-8"?>
-<?mso-contentType ?>
-<FormTemplates xmlns="http://schemas.microsoft.com/sharepoint/v3/contenttype/forms">
-  <Display>DocumentLibraryForm</Display>
-  <Edit>DocumentLibraryForm</Edit>
-  <New>DocumentLibraryForm</New>
-</FormTemplates>
-</file>
-
-<file path=customXml/item3.xml><?xml version="1.0" encoding="utf-8"?>
 <ct:contentTypeSchema xmlns:ct="http://schemas.microsoft.com/office/2006/metadata/contentType" xmlns:ma="http://schemas.microsoft.com/office/2006/metadata/properties/metaAttributes" ct:_="" ma:_="" ma:contentTypeName="ドキュメント" ma:contentTypeID="0x0101005E25E907DDBD434E9320CA1BB4D4AA59" ma:contentTypeVersion="18" ma:contentTypeDescription="新しいドキュメントを作成します。" ma:contentTypeScope="" ma:versionID="5ece6cb8ff669c55680bec9d22ea331b">
   <xsd:schema xmlns:xsd="http://www.w3.org/2001/XMLSchema" xmlns:xs="http://www.w3.org/2001/XMLSchema" xmlns:p="http://schemas.microsoft.com/office/2006/metadata/properties" xmlns:ns3="3963c53f-597e-49f3-8825-2891d3039750" xmlns:ns4="8e351511-a7f6-4092-82a6-9bccf4168657" targetNamespace="http://schemas.microsoft.com/office/2006/metadata/properties" ma:root="true" ma:fieldsID="6068f63bc1548b25cc3dd4430b53260e" ns3:_="" ns4:_="">
     <xsd:import namespace="3963c53f-597e-49f3-8825-2891d3039750"/>
@@ -5273,25 +5278,24 @@
 </ct:contentTypeSchema>
 </file>
 
-<file path=customXml/itemProps1.xml><?xml version="1.0" encoding="utf-8"?>
-<ds:datastoreItem xmlns:ds="http://schemas.openxmlformats.org/officeDocument/2006/customXml" ds:itemID="{36CCBBC6-D353-445F-B05A-B0AECD3591E5}">
-  <ds:schemaRefs>
-    <ds:schemaRef ds:uri="http://schemas.microsoft.com/office/2006/metadata/properties"/>
-    <ds:schemaRef ds:uri="http://schemas.microsoft.com/office/infopath/2007/PartnerControls"/>
-    <ds:schemaRef ds:uri="3963c53f-597e-49f3-8825-2891d3039750"/>
-  </ds:schemaRefs>
-</ds:datastoreItem>
+<file path=customXml/item2.xml><?xml version="1.0" encoding="utf-8"?>
+<?mso-contentType ?>
+<FormTemplates xmlns="http://schemas.microsoft.com/sharepoint/v3/contenttype/forms">
+  <Display>DocumentLibraryForm</Display>
+  <Edit>DocumentLibraryForm</Edit>
+  <New>DocumentLibraryForm</New>
+</FormTemplates>
 </file>
 
-<file path=customXml/itemProps2.xml><?xml version="1.0" encoding="utf-8"?>
-<ds:datastoreItem xmlns:ds="http://schemas.openxmlformats.org/officeDocument/2006/customXml" ds:itemID="{0977E48A-B7BA-4F6F-9E6F-E19874C01286}">
-  <ds:schemaRefs>
-    <ds:schemaRef ds:uri="http://schemas.microsoft.com/sharepoint/v3/contenttype/forms"/>
-  </ds:schemaRefs>
-</ds:datastoreItem>
+<file path=customXml/item3.xml><?xml version="1.0" encoding="utf-8"?>
+<p:properties xmlns:p="http://schemas.microsoft.com/office/2006/metadata/properties" xmlns:xsi="http://www.w3.org/2001/XMLSchema-instance" xmlns:pc="http://schemas.microsoft.com/office/infopath/2007/PartnerControls">
+  <documentManagement>
+    <_activity xmlns="3963c53f-597e-49f3-8825-2891d3039750" xsi:nil="true"/>
+  </documentManagement>
+</p:properties>
 </file>
 
-<file path=customXml/itemProps3.xml><?xml version="1.0" encoding="utf-8"?>
+<file path=customXml/itemProps1.xml><?xml version="1.0" encoding="utf-8"?>
 <ds:datastoreItem xmlns:ds="http://schemas.openxmlformats.org/officeDocument/2006/customXml" ds:itemID="{FB75F15C-8B7C-49F9-8180-CE4E441373B0}">
   <ds:schemaRefs>
     <ds:schemaRef ds:uri="http://schemas.microsoft.com/office/2006/metadata/contentType"/>
@@ -5308,4 +5312,22 @@
     <ds:schemaRef ds:uri="http://schemas.microsoft.com/internal/obd"/>
   </ds:schemaRefs>
 </ds:datastoreItem>
+</file>
+
+<file path=customXml/itemProps2.xml><?xml version="1.0" encoding="utf-8"?>
+<ds:datastoreItem xmlns:ds="http://schemas.openxmlformats.org/officeDocument/2006/customXml" ds:itemID="{0977E48A-B7BA-4F6F-9E6F-E19874C01286}">
+  <ds:schemaRefs>
+    <ds:schemaRef ds:uri="http://schemas.microsoft.com/sharepoint/v3/contenttype/forms"/>
+  </ds:schemaRefs>
+</ds:datastoreItem>
+</file>
+
+<file path=customXml/itemProps3.xml><?xml version="1.0" encoding="utf-8"?>
+<ds:datastoreItem xmlns:ds="http://schemas.openxmlformats.org/officeDocument/2006/customXml" ds:itemID="{36CCBBC6-D353-445F-B05A-B0AECD3591E5}">
+  <ds:schemaRefs>
+    <ds:schemaRef ds:uri="http://schemas.microsoft.com/office/2006/metadata/properties"/>
+    <ds:schemaRef ds:uri="http://schemas.microsoft.com/office/infopath/2007/PartnerControls"/>
+    <ds:schemaRef ds:uri="3963c53f-597e-49f3-8825-2891d3039750"/>
+  </ds:schemaRefs>
+</ds:datastoreItem>
 </file>
</xml_diff>

<commit_message>
Update Word installation documentation
</commit_message>
<xml_diff>
--- a/readme.docx
+++ b/readme.docx
@@ -5,7 +5,7 @@
     <w:p>
       <w:pPr>
         <w:rPr>
-          <w:rFonts w:ascii="ＭＳ Ｐゴシック" w:eastAsia="ＭＳ Ｐゴシック" w:hAnsi="ＭＳ Ｐゴシック" w:hint="eastAsia"/>
+          <w:rFonts w:ascii="ＭＳ Ｐゴシック" w:eastAsia="ＭＳ Ｐゴシック" w:hAnsi="ＭＳ Ｐゴシック"/>
           <w:b/>
           <w:bCs/>
           <w:u w:val="single"/>
@@ -51,7 +51,7 @@
     <w:p>
       <w:pPr>
         <w:rPr>
-          <w:rFonts w:ascii="ＭＳ Ｐゴシック" w:eastAsia="ＭＳ Ｐゴシック" w:hAnsi="ＭＳ Ｐゴシック" w:hint="eastAsia"/>
+          <w:rFonts w:ascii="ＭＳ Ｐゴシック" w:eastAsia="ＭＳ Ｐゴシック" w:hAnsi="ＭＳ Ｐゴシック"/>
         </w:rPr>
       </w:pPr>
       <w:r>
@@ -468,6 +468,58 @@
     </w:p>
     <w:p>
       <w:pPr>
+        <w:rPr>
+          <w:rFonts w:ascii="ＭＳ Ｐゴシック" w:eastAsia="ＭＳ Ｐゴシック" w:hAnsi="ＭＳ Ｐゴシック"/>
+        </w:rPr>
+      </w:pPr>
+    </w:p>
+    <w:p>
+      <w:pPr>
+        <w:rPr>
+          <w:rFonts w:ascii="ＭＳ Ｐゴシック" w:eastAsia="ＭＳ Ｐゴシック" w:hAnsi="ＭＳ Ｐゴシック" w:hint="eastAsia"/>
+        </w:rPr>
+      </w:pPr>
+      <w:r>
+        <w:rPr>
+          <w:rFonts w:ascii="ＭＳ Ｐゴシック" w:eastAsia="ＭＳ Ｐゴシック" w:hAnsi="ＭＳ Ｐゴシック" w:hint="eastAsia"/>
+        </w:rPr>
+        <w:t>当マニュアルは詳細を載せていますが、GitHubのリリースに掲載されている.exeのインストーラーを使う場合、起動はサービス化されます。別に必要な作業はSQL Server（Express可）のインストール、.env</w:t>
+      </w:r>
+      <w:r>
+        <w:rPr>
+          <w:rFonts w:ascii="ＭＳ Ｐゴシック" w:eastAsia="ＭＳ Ｐゴシック" w:hAnsi="ＭＳ Ｐゴシック" w:hint="eastAsia"/>
+        </w:rPr>
+        <w:t>及び</w:t>
+      </w:r>
+      <w:proofErr w:type="spellStart"/>
+      <w:r>
+        <w:rPr>
+          <w:rFonts w:ascii="ＭＳ Ｐゴシック" w:eastAsia="ＭＳ Ｐゴシック" w:hAnsi="ＭＳ Ｐゴシック" w:hint="eastAsia"/>
+        </w:rPr>
+        <w:t>users.json</w:t>
+      </w:r>
+      <w:proofErr w:type="spellEnd"/>
+      <w:r>
+        <w:rPr>
+          <w:rFonts w:ascii="ＭＳ Ｐゴシック" w:eastAsia="ＭＳ Ｐゴシック" w:hAnsi="ＭＳ Ｐゴシック" w:hint="eastAsia"/>
+        </w:rPr>
+        <w:t>を</w:t>
+      </w:r>
+      <w:r>
+        <w:rPr>
+          <w:rFonts w:ascii="ＭＳ Ｐゴシック" w:eastAsia="ＭＳ Ｐゴシック" w:hAnsi="ＭＳ Ｐゴシック" w:hint="eastAsia"/>
+        </w:rPr>
+        <w:t>当手順書の方法で</w:t>
+      </w:r>
+      <w:r>
+        <w:rPr>
+          <w:rFonts w:ascii="ＭＳ Ｐゴシック" w:eastAsia="ＭＳ Ｐゴシック" w:hAnsi="ＭＳ Ｐゴシック" w:hint="eastAsia"/>
+        </w:rPr>
+        <w:t>ルートフォルダに作成することになります。</w:t>
+      </w:r>
+    </w:p>
+    <w:p>
+      <w:pPr>
         <w:widowControl/>
         <w:jc w:val="left"/>
         <w:rPr>
@@ -669,6 +721,12 @@
           <w:rFonts w:ascii="ＭＳ Ｐゴシック" w:eastAsia="ＭＳ Ｐゴシック" w:hAnsi="ＭＳ Ｐゴシック"/>
         </w:rPr>
         <w:t>IIS</w:t>
+      </w:r>
+      <w:r>
+        <w:rPr>
+          <w:rFonts w:ascii="ＭＳ Ｐゴシック" w:eastAsia="ＭＳ Ｐゴシック" w:hAnsi="ＭＳ Ｐゴシック" w:hint="eastAsia"/>
+        </w:rPr>
+        <w:t xml:space="preserve">　（独自ドメインSSLを使わない場合は不要）</w:t>
       </w:r>
     </w:p>
     <w:p>
@@ -5026,6 +5084,23 @@
 </file>
 
 <file path=customXml/item1.xml><?xml version="1.0" encoding="utf-8"?>
+<p:properties xmlns:p="http://schemas.microsoft.com/office/2006/metadata/properties" xmlns:xsi="http://www.w3.org/2001/XMLSchema-instance" xmlns:pc="http://schemas.microsoft.com/office/infopath/2007/PartnerControls">
+  <documentManagement>
+    <_activity xmlns="3963c53f-597e-49f3-8825-2891d3039750" xsi:nil="true"/>
+  </documentManagement>
+</p:properties>
+</file>
+
+<file path=customXml/item2.xml><?xml version="1.0" encoding="utf-8"?>
+<?mso-contentType ?>
+<FormTemplates xmlns="http://schemas.microsoft.com/sharepoint/v3/contenttype/forms">
+  <Display>DocumentLibraryForm</Display>
+  <Edit>DocumentLibraryForm</Edit>
+  <New>DocumentLibraryForm</New>
+</FormTemplates>
+</file>
+
+<file path=customXml/item3.xml><?xml version="1.0" encoding="utf-8"?>
 <ct:contentTypeSchema xmlns:ct="http://schemas.microsoft.com/office/2006/metadata/contentType" xmlns:ma="http://schemas.microsoft.com/office/2006/metadata/properties/metaAttributes" ct:_="" ma:_="" ma:contentTypeName="ドキュメント" ma:contentTypeID="0x0101005E25E907DDBD434E9320CA1BB4D4AA59" ma:contentTypeVersion="18" ma:contentTypeDescription="新しいドキュメントを作成します。" ma:contentTypeScope="" ma:versionID="5ece6cb8ff669c55680bec9d22ea331b">
   <xsd:schema xmlns:xsd="http://www.w3.org/2001/XMLSchema" xmlns:xs="http://www.w3.org/2001/XMLSchema" xmlns:p="http://schemas.microsoft.com/office/2006/metadata/properties" xmlns:ns3="3963c53f-597e-49f3-8825-2891d3039750" xmlns:ns4="8e351511-a7f6-4092-82a6-9bccf4168657" targetNamespace="http://schemas.microsoft.com/office/2006/metadata/properties" ma:root="true" ma:fieldsID="6068f63bc1548b25cc3dd4430b53260e" ns3:_="" ns4:_="">
     <xsd:import namespace="3963c53f-597e-49f3-8825-2891d3039750"/>
@@ -5278,24 +5353,25 @@
 </ct:contentTypeSchema>
 </file>
 
-<file path=customXml/item2.xml><?xml version="1.0" encoding="utf-8"?>
-<?mso-contentType ?>
-<FormTemplates xmlns="http://schemas.microsoft.com/sharepoint/v3/contenttype/forms">
-  <Display>DocumentLibraryForm</Display>
-  <Edit>DocumentLibraryForm</Edit>
-  <New>DocumentLibraryForm</New>
-</FormTemplates>
+<file path=customXml/itemProps1.xml><?xml version="1.0" encoding="utf-8"?>
+<ds:datastoreItem xmlns:ds="http://schemas.openxmlformats.org/officeDocument/2006/customXml" ds:itemID="{36CCBBC6-D353-445F-B05A-B0AECD3591E5}">
+  <ds:schemaRefs>
+    <ds:schemaRef ds:uri="http://schemas.microsoft.com/office/2006/metadata/properties"/>
+    <ds:schemaRef ds:uri="http://schemas.microsoft.com/office/infopath/2007/PartnerControls"/>
+    <ds:schemaRef ds:uri="3963c53f-597e-49f3-8825-2891d3039750"/>
+  </ds:schemaRefs>
+</ds:datastoreItem>
 </file>
 
-<file path=customXml/item3.xml><?xml version="1.0" encoding="utf-8"?>
-<p:properties xmlns:p="http://schemas.microsoft.com/office/2006/metadata/properties" xmlns:xsi="http://www.w3.org/2001/XMLSchema-instance" xmlns:pc="http://schemas.microsoft.com/office/infopath/2007/PartnerControls">
-  <documentManagement>
-    <_activity xmlns="3963c53f-597e-49f3-8825-2891d3039750" xsi:nil="true"/>
-  </documentManagement>
-</p:properties>
+<file path=customXml/itemProps2.xml><?xml version="1.0" encoding="utf-8"?>
+<ds:datastoreItem xmlns:ds="http://schemas.openxmlformats.org/officeDocument/2006/customXml" ds:itemID="{0977E48A-B7BA-4F6F-9E6F-E19874C01286}">
+  <ds:schemaRefs>
+    <ds:schemaRef ds:uri="http://schemas.microsoft.com/sharepoint/v3/contenttype/forms"/>
+  </ds:schemaRefs>
+</ds:datastoreItem>
 </file>
 
-<file path=customXml/itemProps1.xml><?xml version="1.0" encoding="utf-8"?>
+<file path=customXml/itemProps3.xml><?xml version="1.0" encoding="utf-8"?>
 <ds:datastoreItem xmlns:ds="http://schemas.openxmlformats.org/officeDocument/2006/customXml" ds:itemID="{FB75F15C-8B7C-49F9-8180-CE4E441373B0}">
   <ds:schemaRefs>
     <ds:schemaRef ds:uri="http://schemas.microsoft.com/office/2006/metadata/contentType"/>
@@ -5312,22 +5388,4 @@
     <ds:schemaRef ds:uri="http://schemas.microsoft.com/internal/obd"/>
   </ds:schemaRefs>
 </ds:datastoreItem>
-</file>
-
-<file path=customXml/itemProps2.xml><?xml version="1.0" encoding="utf-8"?>
-<ds:datastoreItem xmlns:ds="http://schemas.openxmlformats.org/officeDocument/2006/customXml" ds:itemID="{0977E48A-B7BA-4F6F-9E6F-E19874C01286}">
-  <ds:schemaRefs>
-    <ds:schemaRef ds:uri="http://schemas.microsoft.com/sharepoint/v3/contenttype/forms"/>
-  </ds:schemaRefs>
-</ds:datastoreItem>
-</file>
-
-<file path=customXml/itemProps3.xml><?xml version="1.0" encoding="utf-8"?>
-<ds:datastoreItem xmlns:ds="http://schemas.openxmlformats.org/officeDocument/2006/customXml" ds:itemID="{36CCBBC6-D353-445F-B05A-B0AECD3591E5}">
-  <ds:schemaRefs>
-    <ds:schemaRef ds:uri="http://schemas.microsoft.com/office/2006/metadata/properties"/>
-    <ds:schemaRef ds:uri="http://schemas.microsoft.com/office/infopath/2007/PartnerControls"/>
-    <ds:schemaRef ds:uri="3963c53f-597e-49f3-8825-2891d3039750"/>
-  </ds:schemaRefs>
-</ds:datastoreItem>
 </file>
</xml_diff>